<commit_message>
lab4 word file updated
</commit_message>
<xml_diff>
--- a/LAB4/DSA LAB 4 TASKS.docx
+++ b/LAB4/DSA LAB 4 TASKS.docx
@@ -19662,7 +19662,4727 @@
       </w:r>
     </w:p>
     <w:p>
-      <w:r>
+      <w:pPr>
+        <w:pStyle w:val="PlainText"/>
+        <w:rPr>
+          <w:rFonts w:ascii="Courier New" w:hAnsi="Courier New" w:cs="Courier New"/>
+        </w:rPr>
+      </w:pPr>
+      <w:r>
+        <w:t>CODE:</w:t>
+      </w:r>
+      <w:r>
+        <w:br/>
+      </w:r>
+      <w:r>
+        <w:rPr>
+          <w:rFonts w:ascii="Courier New" w:hAnsi="Courier New" w:cs="Courier New"/>
+        </w:rPr>
+        <w:t>#include &lt;iostream&gt;</w:t>
+      </w:r>
+    </w:p>
+    <w:p>
+      <w:pPr>
+        <w:pStyle w:val="PlainText"/>
+        <w:rPr>
+          <w:rFonts w:ascii="Courier New" w:hAnsi="Courier New" w:cs="Courier New"/>
+        </w:rPr>
+      </w:pPr>
+      <w:r>
+        <w:rPr>
+          <w:rFonts w:ascii="Courier New" w:hAnsi="Courier New" w:cs="Courier New"/>
+        </w:rPr>
+        <w:t>using namespace std;</w:t>
+      </w:r>
+    </w:p>
+    <w:p>
+      <w:pPr>
+        <w:pStyle w:val="PlainText"/>
+        <w:rPr>
+          <w:rFonts w:ascii="Courier New" w:hAnsi="Courier New" w:cs="Courier New"/>
+        </w:rPr>
+      </w:pPr>
+    </w:p>
+    <w:p>
+      <w:pPr>
+        <w:pStyle w:val="PlainText"/>
+        <w:rPr>
+          <w:rFonts w:ascii="Courier New" w:hAnsi="Courier New" w:cs="Courier New"/>
+        </w:rPr>
+      </w:pPr>
+      <w:r>
+        <w:rPr>
+          <w:rFonts w:ascii="Courier New" w:hAnsi="Courier New" w:cs="Courier New"/>
+        </w:rPr>
+        <w:t>class Node{</w:t>
+      </w:r>
+    </w:p>
+    <w:p>
+      <w:pPr>
+        <w:pStyle w:val="PlainText"/>
+        <w:rPr>
+          <w:rFonts w:ascii="Courier New" w:hAnsi="Courier New" w:cs="Courier New"/>
+        </w:rPr>
+      </w:pPr>
+      <w:r>
+        <w:rPr>
+          <w:rFonts w:ascii="Courier New" w:hAnsi="Courier New" w:cs="Courier New"/>
+        </w:rPr>
+        <w:t xml:space="preserve">    public:</w:t>
+      </w:r>
+    </w:p>
+    <w:p>
+      <w:pPr>
+        <w:pStyle w:val="PlainText"/>
+        <w:rPr>
+          <w:rFonts w:ascii="Courier New" w:hAnsi="Courier New" w:cs="Courier New"/>
+        </w:rPr>
+      </w:pPr>
+      <w:r>
+        <w:rPr>
+          <w:rFonts w:ascii="Courier New" w:hAnsi="Courier New" w:cs="Courier New"/>
+        </w:rPr>
+        <w:t xml:space="preserve">    int data;</w:t>
+      </w:r>
+    </w:p>
+    <w:p>
+      <w:pPr>
+        <w:pStyle w:val="PlainText"/>
+        <w:rPr>
+          <w:rFonts w:ascii="Courier New" w:hAnsi="Courier New" w:cs="Courier New"/>
+        </w:rPr>
+      </w:pPr>
+      <w:r>
+        <w:rPr>
+          <w:rFonts w:ascii="Courier New" w:hAnsi="Courier New" w:cs="Courier New"/>
+        </w:rPr>
+        <w:t xml:space="preserve">    Node* next;</w:t>
+      </w:r>
+    </w:p>
+    <w:p>
+      <w:pPr>
+        <w:pStyle w:val="PlainText"/>
+        <w:rPr>
+          <w:rFonts w:ascii="Courier New" w:hAnsi="Courier New" w:cs="Courier New"/>
+        </w:rPr>
+      </w:pPr>
+    </w:p>
+    <w:p>
+      <w:pPr>
+        <w:pStyle w:val="PlainText"/>
+        <w:rPr>
+          <w:rFonts w:ascii="Courier New" w:hAnsi="Courier New" w:cs="Courier New"/>
+        </w:rPr>
+      </w:pPr>
+      <w:r>
+        <w:rPr>
+          <w:rFonts w:ascii="Courier New" w:hAnsi="Courier New" w:cs="Courier New"/>
+        </w:rPr>
+        <w:t xml:space="preserve">    Node(int </w:t>
+      </w:r>
+      <w:proofErr w:type="spellStart"/>
+      <w:r>
+        <w:rPr>
+          <w:rFonts w:ascii="Courier New" w:hAnsi="Courier New" w:cs="Courier New"/>
+        </w:rPr>
+        <w:t>val</w:t>
+      </w:r>
+      <w:proofErr w:type="spellEnd"/>
+      <w:r>
+        <w:rPr>
+          <w:rFonts w:ascii="Courier New" w:hAnsi="Courier New" w:cs="Courier New"/>
+        </w:rPr>
+        <w:t>){</w:t>
+      </w:r>
+    </w:p>
+    <w:p>
+      <w:pPr>
+        <w:pStyle w:val="PlainText"/>
+        <w:rPr>
+          <w:rFonts w:ascii="Courier New" w:hAnsi="Courier New" w:cs="Courier New"/>
+        </w:rPr>
+      </w:pPr>
+      <w:r>
+        <w:rPr>
+          <w:rFonts w:ascii="Courier New" w:hAnsi="Courier New" w:cs="Courier New"/>
+        </w:rPr>
+        <w:t xml:space="preserve">        data = </w:t>
+      </w:r>
+      <w:proofErr w:type="spellStart"/>
+      <w:r>
+        <w:rPr>
+          <w:rFonts w:ascii="Courier New" w:hAnsi="Courier New" w:cs="Courier New"/>
+        </w:rPr>
+        <w:t>val</w:t>
+      </w:r>
+      <w:proofErr w:type="spellEnd"/>
+      <w:r>
+        <w:rPr>
+          <w:rFonts w:ascii="Courier New" w:hAnsi="Courier New" w:cs="Courier New"/>
+        </w:rPr>
+        <w:t>;</w:t>
+      </w:r>
+    </w:p>
+    <w:p>
+      <w:pPr>
+        <w:pStyle w:val="PlainText"/>
+        <w:rPr>
+          <w:rFonts w:ascii="Courier New" w:hAnsi="Courier New" w:cs="Courier New"/>
+        </w:rPr>
+      </w:pPr>
+      <w:r>
+        <w:rPr>
+          <w:rFonts w:ascii="Courier New" w:hAnsi="Courier New" w:cs="Courier New"/>
+        </w:rPr>
+        <w:t xml:space="preserve">        next = NULL;</w:t>
+      </w:r>
+    </w:p>
+    <w:p>
+      <w:pPr>
+        <w:pStyle w:val="PlainText"/>
+        <w:rPr>
+          <w:rFonts w:ascii="Courier New" w:hAnsi="Courier New" w:cs="Courier New"/>
+        </w:rPr>
+      </w:pPr>
+      <w:r>
+        <w:rPr>
+          <w:rFonts w:ascii="Courier New" w:hAnsi="Courier New" w:cs="Courier New"/>
+        </w:rPr>
+        <w:t xml:space="preserve">    }</w:t>
+      </w:r>
+    </w:p>
+    <w:p>
+      <w:pPr>
+        <w:pStyle w:val="PlainText"/>
+        <w:rPr>
+          <w:rFonts w:ascii="Courier New" w:hAnsi="Courier New" w:cs="Courier New"/>
+        </w:rPr>
+      </w:pPr>
+      <w:r>
+        <w:rPr>
+          <w:rFonts w:ascii="Courier New" w:hAnsi="Courier New" w:cs="Courier New"/>
+        </w:rPr>
+        <w:t>};</w:t>
+      </w:r>
+    </w:p>
+    <w:p>
+      <w:pPr>
+        <w:pStyle w:val="PlainText"/>
+        <w:rPr>
+          <w:rFonts w:ascii="Courier New" w:hAnsi="Courier New" w:cs="Courier New"/>
+        </w:rPr>
+      </w:pPr>
+    </w:p>
+    <w:p>
+      <w:pPr>
+        <w:pStyle w:val="PlainText"/>
+        <w:rPr>
+          <w:rFonts w:ascii="Courier New" w:hAnsi="Courier New" w:cs="Courier New"/>
+        </w:rPr>
+      </w:pPr>
+      <w:r>
+        <w:rPr>
+          <w:rFonts w:ascii="Courier New" w:hAnsi="Courier New" w:cs="Courier New"/>
+        </w:rPr>
+        <w:t>class CL{</w:t>
+      </w:r>
+    </w:p>
+    <w:p>
+      <w:pPr>
+        <w:pStyle w:val="PlainText"/>
+        <w:rPr>
+          <w:rFonts w:ascii="Courier New" w:hAnsi="Courier New" w:cs="Courier New"/>
+        </w:rPr>
+      </w:pPr>
+      <w:r>
+        <w:rPr>
+          <w:rFonts w:ascii="Courier New" w:hAnsi="Courier New" w:cs="Courier New"/>
+        </w:rPr>
+        <w:t xml:space="preserve">    Node* head;</w:t>
+      </w:r>
+    </w:p>
+    <w:p>
+      <w:pPr>
+        <w:pStyle w:val="PlainText"/>
+        <w:rPr>
+          <w:rFonts w:ascii="Courier New" w:hAnsi="Courier New" w:cs="Courier New"/>
+        </w:rPr>
+      </w:pPr>
+      <w:r>
+        <w:rPr>
+          <w:rFonts w:ascii="Courier New" w:hAnsi="Courier New" w:cs="Courier New"/>
+        </w:rPr>
+        <w:t xml:space="preserve">    Node* tail;</w:t>
+      </w:r>
+    </w:p>
+    <w:p>
+      <w:pPr>
+        <w:pStyle w:val="PlainText"/>
+        <w:rPr>
+          <w:rFonts w:ascii="Courier New" w:hAnsi="Courier New" w:cs="Courier New"/>
+        </w:rPr>
+      </w:pPr>
+    </w:p>
+    <w:p>
+      <w:pPr>
+        <w:pStyle w:val="PlainText"/>
+        <w:rPr>
+          <w:rFonts w:ascii="Courier New" w:hAnsi="Courier New" w:cs="Courier New"/>
+        </w:rPr>
+      </w:pPr>
+      <w:r>
+        <w:rPr>
+          <w:rFonts w:ascii="Courier New" w:hAnsi="Courier New" w:cs="Courier New"/>
+        </w:rPr>
+        <w:t xml:space="preserve">    public:</w:t>
+      </w:r>
+    </w:p>
+    <w:p>
+      <w:pPr>
+        <w:pStyle w:val="PlainText"/>
+        <w:rPr>
+          <w:rFonts w:ascii="Courier New" w:hAnsi="Courier New" w:cs="Courier New"/>
+        </w:rPr>
+      </w:pPr>
+      <w:r>
+        <w:rPr>
+          <w:rFonts w:ascii="Courier New" w:hAnsi="Courier New" w:cs="Courier New"/>
+        </w:rPr>
+        <w:t xml:space="preserve">    CL(){</w:t>
+      </w:r>
+    </w:p>
+    <w:p>
+      <w:pPr>
+        <w:pStyle w:val="PlainText"/>
+        <w:rPr>
+          <w:rFonts w:ascii="Courier New" w:hAnsi="Courier New" w:cs="Courier New"/>
+        </w:rPr>
+      </w:pPr>
+      <w:r>
+        <w:rPr>
+          <w:rFonts w:ascii="Courier New" w:hAnsi="Courier New" w:cs="Courier New"/>
+        </w:rPr>
+        <w:t xml:space="preserve">        head = tail = NULL;</w:t>
+      </w:r>
+    </w:p>
+    <w:p>
+      <w:pPr>
+        <w:pStyle w:val="PlainText"/>
+        <w:rPr>
+          <w:rFonts w:ascii="Courier New" w:hAnsi="Courier New" w:cs="Courier New"/>
+        </w:rPr>
+      </w:pPr>
+      <w:r>
+        <w:rPr>
+          <w:rFonts w:ascii="Courier New" w:hAnsi="Courier New" w:cs="Courier New"/>
+        </w:rPr>
+        <w:t xml:space="preserve">    }</w:t>
+      </w:r>
+    </w:p>
+    <w:p>
+      <w:pPr>
+        <w:pStyle w:val="PlainText"/>
+        <w:rPr>
+          <w:rFonts w:ascii="Courier New" w:hAnsi="Courier New" w:cs="Courier New"/>
+        </w:rPr>
+      </w:pPr>
+    </w:p>
+    <w:p>
+      <w:pPr>
+        <w:pStyle w:val="PlainText"/>
+        <w:rPr>
+          <w:rFonts w:ascii="Courier New" w:hAnsi="Courier New" w:cs="Courier New"/>
+        </w:rPr>
+      </w:pPr>
+      <w:r>
+        <w:rPr>
+          <w:rFonts w:ascii="Courier New" w:hAnsi="Courier New" w:cs="Courier New"/>
+        </w:rPr>
+        <w:t xml:space="preserve">    void </w:t>
+      </w:r>
+      <w:proofErr w:type="spellStart"/>
+      <w:r>
+        <w:rPr>
+          <w:rFonts w:ascii="Courier New" w:hAnsi="Courier New" w:cs="Courier New"/>
+        </w:rPr>
+        <w:t>insertEnd</w:t>
+      </w:r>
+      <w:proofErr w:type="spellEnd"/>
+      <w:r>
+        <w:rPr>
+          <w:rFonts w:ascii="Courier New" w:hAnsi="Courier New" w:cs="Courier New"/>
+        </w:rPr>
+        <w:t xml:space="preserve">(int </w:t>
+      </w:r>
+      <w:proofErr w:type="spellStart"/>
+      <w:r>
+        <w:rPr>
+          <w:rFonts w:ascii="Courier New" w:hAnsi="Courier New" w:cs="Courier New"/>
+        </w:rPr>
+        <w:t>val</w:t>
+      </w:r>
+      <w:proofErr w:type="spellEnd"/>
+      <w:r>
+        <w:rPr>
+          <w:rFonts w:ascii="Courier New" w:hAnsi="Courier New" w:cs="Courier New"/>
+        </w:rPr>
+        <w:t>){</w:t>
+      </w:r>
+    </w:p>
+    <w:p>
+      <w:pPr>
+        <w:pStyle w:val="PlainText"/>
+        <w:rPr>
+          <w:rFonts w:ascii="Courier New" w:hAnsi="Courier New" w:cs="Courier New"/>
+        </w:rPr>
+      </w:pPr>
+      <w:r>
+        <w:rPr>
+          <w:rFonts w:ascii="Courier New" w:hAnsi="Courier New" w:cs="Courier New"/>
+        </w:rPr>
+        <w:t xml:space="preserve">        Node* </w:t>
+      </w:r>
+      <w:proofErr w:type="spellStart"/>
+      <w:r>
+        <w:rPr>
+          <w:rFonts w:ascii="Courier New" w:hAnsi="Courier New" w:cs="Courier New"/>
+        </w:rPr>
+        <w:t>newnode</w:t>
+      </w:r>
+      <w:proofErr w:type="spellEnd"/>
+      <w:r>
+        <w:rPr>
+          <w:rFonts w:ascii="Courier New" w:hAnsi="Courier New" w:cs="Courier New"/>
+        </w:rPr>
+        <w:t xml:space="preserve"> = new Node(</w:t>
+      </w:r>
+      <w:proofErr w:type="spellStart"/>
+      <w:r>
+        <w:rPr>
+          <w:rFonts w:ascii="Courier New" w:hAnsi="Courier New" w:cs="Courier New"/>
+        </w:rPr>
+        <w:t>val</w:t>
+      </w:r>
+      <w:proofErr w:type="spellEnd"/>
+      <w:r>
+        <w:rPr>
+          <w:rFonts w:ascii="Courier New" w:hAnsi="Courier New" w:cs="Courier New"/>
+        </w:rPr>
+        <w:t>);</w:t>
+      </w:r>
+    </w:p>
+    <w:p>
+      <w:pPr>
+        <w:pStyle w:val="PlainText"/>
+        <w:rPr>
+          <w:rFonts w:ascii="Courier New" w:hAnsi="Courier New" w:cs="Courier New"/>
+        </w:rPr>
+      </w:pPr>
+    </w:p>
+    <w:p>
+      <w:pPr>
+        <w:pStyle w:val="PlainText"/>
+        <w:rPr>
+          <w:rFonts w:ascii="Courier New" w:hAnsi="Courier New" w:cs="Courier New"/>
+        </w:rPr>
+      </w:pPr>
+      <w:r>
+        <w:rPr>
+          <w:rFonts w:ascii="Courier New" w:hAnsi="Courier New" w:cs="Courier New"/>
+        </w:rPr>
+        <w:t xml:space="preserve">        if(head == NULL){</w:t>
+      </w:r>
+    </w:p>
+    <w:p>
+      <w:pPr>
+        <w:pStyle w:val="PlainText"/>
+        <w:rPr>
+          <w:rFonts w:ascii="Courier New" w:hAnsi="Courier New" w:cs="Courier New"/>
+        </w:rPr>
+      </w:pPr>
+      <w:r>
+        <w:rPr>
+          <w:rFonts w:ascii="Courier New" w:hAnsi="Courier New" w:cs="Courier New"/>
+        </w:rPr>
+        <w:t xml:space="preserve">            head = tail = </w:t>
+      </w:r>
+      <w:proofErr w:type="spellStart"/>
+      <w:r>
+        <w:rPr>
+          <w:rFonts w:ascii="Courier New" w:hAnsi="Courier New" w:cs="Courier New"/>
+        </w:rPr>
+        <w:t>newnode</w:t>
+      </w:r>
+      <w:proofErr w:type="spellEnd"/>
+      <w:r>
+        <w:rPr>
+          <w:rFonts w:ascii="Courier New" w:hAnsi="Courier New" w:cs="Courier New"/>
+        </w:rPr>
+        <w:t>;</w:t>
+      </w:r>
+    </w:p>
+    <w:p>
+      <w:pPr>
+        <w:pStyle w:val="PlainText"/>
+        <w:rPr>
+          <w:rFonts w:ascii="Courier New" w:hAnsi="Courier New" w:cs="Courier New"/>
+        </w:rPr>
+      </w:pPr>
+      <w:r>
+        <w:rPr>
+          <w:rFonts w:ascii="Courier New" w:hAnsi="Courier New" w:cs="Courier New"/>
+        </w:rPr>
+        <w:t xml:space="preserve">            tail-&gt;next = head;</w:t>
+      </w:r>
+    </w:p>
+    <w:p>
+      <w:pPr>
+        <w:pStyle w:val="PlainText"/>
+        <w:rPr>
+          <w:rFonts w:ascii="Courier New" w:hAnsi="Courier New" w:cs="Courier New"/>
+        </w:rPr>
+      </w:pPr>
+      <w:r>
+        <w:rPr>
+          <w:rFonts w:ascii="Courier New" w:hAnsi="Courier New" w:cs="Courier New"/>
+        </w:rPr>
+        <w:t xml:space="preserve">        }</w:t>
+      </w:r>
+    </w:p>
+    <w:p>
+      <w:pPr>
+        <w:pStyle w:val="PlainText"/>
+        <w:rPr>
+          <w:rFonts w:ascii="Courier New" w:hAnsi="Courier New" w:cs="Courier New"/>
+        </w:rPr>
+      </w:pPr>
+      <w:r>
+        <w:rPr>
+          <w:rFonts w:ascii="Courier New" w:hAnsi="Courier New" w:cs="Courier New"/>
+        </w:rPr>
+        <w:t xml:space="preserve">        else{</w:t>
+      </w:r>
+    </w:p>
+    <w:p>
+      <w:pPr>
+        <w:pStyle w:val="PlainText"/>
+        <w:rPr>
+          <w:rFonts w:ascii="Courier New" w:hAnsi="Courier New" w:cs="Courier New"/>
+        </w:rPr>
+      </w:pPr>
+      <w:r>
+        <w:rPr>
+          <w:rFonts w:ascii="Courier New" w:hAnsi="Courier New" w:cs="Courier New"/>
+        </w:rPr>
+        <w:t xml:space="preserve">            </w:t>
+      </w:r>
+      <w:proofErr w:type="spellStart"/>
+      <w:r>
+        <w:rPr>
+          <w:rFonts w:ascii="Courier New" w:hAnsi="Courier New" w:cs="Courier New"/>
+        </w:rPr>
+        <w:t>newnode</w:t>
+      </w:r>
+      <w:proofErr w:type="spellEnd"/>
+      <w:r>
+        <w:rPr>
+          <w:rFonts w:ascii="Courier New" w:hAnsi="Courier New" w:cs="Courier New"/>
+        </w:rPr>
+        <w:t>-&gt;next = head;</w:t>
+      </w:r>
+    </w:p>
+    <w:p>
+      <w:pPr>
+        <w:pStyle w:val="PlainText"/>
+        <w:rPr>
+          <w:rFonts w:ascii="Courier New" w:hAnsi="Courier New" w:cs="Courier New"/>
+        </w:rPr>
+      </w:pPr>
+      <w:r>
+        <w:rPr>
+          <w:rFonts w:ascii="Courier New" w:hAnsi="Courier New" w:cs="Courier New"/>
+        </w:rPr>
+        <w:t xml:space="preserve">            tail-&gt;next = </w:t>
+      </w:r>
+      <w:proofErr w:type="spellStart"/>
+      <w:r>
+        <w:rPr>
+          <w:rFonts w:ascii="Courier New" w:hAnsi="Courier New" w:cs="Courier New"/>
+        </w:rPr>
+        <w:t>newnode</w:t>
+      </w:r>
+      <w:proofErr w:type="spellEnd"/>
+      <w:r>
+        <w:rPr>
+          <w:rFonts w:ascii="Courier New" w:hAnsi="Courier New" w:cs="Courier New"/>
+        </w:rPr>
+        <w:t>;</w:t>
+      </w:r>
+    </w:p>
+    <w:p>
+      <w:pPr>
+        <w:pStyle w:val="PlainText"/>
+        <w:rPr>
+          <w:rFonts w:ascii="Courier New" w:hAnsi="Courier New" w:cs="Courier New"/>
+        </w:rPr>
+      </w:pPr>
+      <w:r>
+        <w:rPr>
+          <w:rFonts w:ascii="Courier New" w:hAnsi="Courier New" w:cs="Courier New"/>
+        </w:rPr>
+        <w:t xml:space="preserve">            tail = </w:t>
+      </w:r>
+      <w:proofErr w:type="spellStart"/>
+      <w:r>
+        <w:rPr>
+          <w:rFonts w:ascii="Courier New" w:hAnsi="Courier New" w:cs="Courier New"/>
+        </w:rPr>
+        <w:t>newnode</w:t>
+      </w:r>
+      <w:proofErr w:type="spellEnd"/>
+      <w:r>
+        <w:rPr>
+          <w:rFonts w:ascii="Courier New" w:hAnsi="Courier New" w:cs="Courier New"/>
+        </w:rPr>
+        <w:t>;</w:t>
+      </w:r>
+    </w:p>
+    <w:p>
+      <w:pPr>
+        <w:pStyle w:val="PlainText"/>
+        <w:rPr>
+          <w:rFonts w:ascii="Courier New" w:hAnsi="Courier New" w:cs="Courier New"/>
+        </w:rPr>
+      </w:pPr>
+      <w:r>
+        <w:rPr>
+          <w:rFonts w:ascii="Courier New" w:hAnsi="Courier New" w:cs="Courier New"/>
+        </w:rPr>
+        <w:t xml:space="preserve">        }</w:t>
+      </w:r>
+    </w:p>
+    <w:p>
+      <w:pPr>
+        <w:pStyle w:val="PlainText"/>
+        <w:rPr>
+          <w:rFonts w:ascii="Courier New" w:hAnsi="Courier New" w:cs="Courier New"/>
+        </w:rPr>
+      </w:pPr>
+      <w:r>
+        <w:rPr>
+          <w:rFonts w:ascii="Courier New" w:hAnsi="Courier New" w:cs="Courier New"/>
+        </w:rPr>
+        <w:t xml:space="preserve">    }</w:t>
+      </w:r>
+    </w:p>
+    <w:p>
+      <w:pPr>
+        <w:pStyle w:val="PlainText"/>
+        <w:rPr>
+          <w:rFonts w:ascii="Courier New" w:hAnsi="Courier New" w:cs="Courier New"/>
+        </w:rPr>
+      </w:pPr>
+    </w:p>
+    <w:p>
+      <w:pPr>
+        <w:pStyle w:val="PlainText"/>
+        <w:rPr>
+          <w:rFonts w:ascii="Courier New" w:hAnsi="Courier New" w:cs="Courier New"/>
+        </w:rPr>
+      </w:pPr>
+      <w:r>
+        <w:rPr>
+          <w:rFonts w:ascii="Courier New" w:hAnsi="Courier New" w:cs="Courier New"/>
+        </w:rPr>
+        <w:t xml:space="preserve">    void </w:t>
+      </w:r>
+      <w:proofErr w:type="spellStart"/>
+      <w:r>
+        <w:rPr>
+          <w:rFonts w:ascii="Courier New" w:hAnsi="Courier New" w:cs="Courier New"/>
+        </w:rPr>
+        <w:t>insertBeg</w:t>
+      </w:r>
+      <w:proofErr w:type="spellEnd"/>
+      <w:r>
+        <w:rPr>
+          <w:rFonts w:ascii="Courier New" w:hAnsi="Courier New" w:cs="Courier New"/>
+        </w:rPr>
+        <w:t xml:space="preserve">(int </w:t>
+      </w:r>
+      <w:proofErr w:type="spellStart"/>
+      <w:r>
+        <w:rPr>
+          <w:rFonts w:ascii="Courier New" w:hAnsi="Courier New" w:cs="Courier New"/>
+        </w:rPr>
+        <w:t>val</w:t>
+      </w:r>
+      <w:proofErr w:type="spellEnd"/>
+      <w:r>
+        <w:rPr>
+          <w:rFonts w:ascii="Courier New" w:hAnsi="Courier New" w:cs="Courier New"/>
+        </w:rPr>
+        <w:t>){</w:t>
+      </w:r>
+    </w:p>
+    <w:p>
+      <w:pPr>
+        <w:pStyle w:val="PlainText"/>
+        <w:rPr>
+          <w:rFonts w:ascii="Courier New" w:hAnsi="Courier New" w:cs="Courier New"/>
+        </w:rPr>
+      </w:pPr>
+      <w:r>
+        <w:rPr>
+          <w:rFonts w:ascii="Courier New" w:hAnsi="Courier New" w:cs="Courier New"/>
+        </w:rPr>
+        <w:t xml:space="preserve">        Node* </w:t>
+      </w:r>
+      <w:proofErr w:type="spellStart"/>
+      <w:r>
+        <w:rPr>
+          <w:rFonts w:ascii="Courier New" w:hAnsi="Courier New" w:cs="Courier New"/>
+        </w:rPr>
+        <w:t>newnode</w:t>
+      </w:r>
+      <w:proofErr w:type="spellEnd"/>
+      <w:r>
+        <w:rPr>
+          <w:rFonts w:ascii="Courier New" w:hAnsi="Courier New" w:cs="Courier New"/>
+        </w:rPr>
+        <w:t xml:space="preserve"> = new Node(</w:t>
+      </w:r>
+      <w:proofErr w:type="spellStart"/>
+      <w:r>
+        <w:rPr>
+          <w:rFonts w:ascii="Courier New" w:hAnsi="Courier New" w:cs="Courier New"/>
+        </w:rPr>
+        <w:t>val</w:t>
+      </w:r>
+      <w:proofErr w:type="spellEnd"/>
+      <w:r>
+        <w:rPr>
+          <w:rFonts w:ascii="Courier New" w:hAnsi="Courier New" w:cs="Courier New"/>
+        </w:rPr>
+        <w:t>);</w:t>
+      </w:r>
+    </w:p>
+    <w:p>
+      <w:pPr>
+        <w:pStyle w:val="PlainText"/>
+        <w:rPr>
+          <w:rFonts w:ascii="Courier New" w:hAnsi="Courier New" w:cs="Courier New"/>
+        </w:rPr>
+      </w:pPr>
+    </w:p>
+    <w:p>
+      <w:pPr>
+        <w:pStyle w:val="PlainText"/>
+        <w:rPr>
+          <w:rFonts w:ascii="Courier New" w:hAnsi="Courier New" w:cs="Courier New"/>
+        </w:rPr>
+      </w:pPr>
+      <w:r>
+        <w:rPr>
+          <w:rFonts w:ascii="Courier New" w:hAnsi="Courier New" w:cs="Courier New"/>
+        </w:rPr>
+        <w:t xml:space="preserve">        if(head == NULL){</w:t>
+      </w:r>
+    </w:p>
+    <w:p>
+      <w:pPr>
+        <w:pStyle w:val="PlainText"/>
+        <w:rPr>
+          <w:rFonts w:ascii="Courier New" w:hAnsi="Courier New" w:cs="Courier New"/>
+        </w:rPr>
+      </w:pPr>
+      <w:r>
+        <w:rPr>
+          <w:rFonts w:ascii="Courier New" w:hAnsi="Courier New" w:cs="Courier New"/>
+        </w:rPr>
+        <w:t xml:space="preserve">            head = tail = </w:t>
+      </w:r>
+      <w:proofErr w:type="spellStart"/>
+      <w:r>
+        <w:rPr>
+          <w:rFonts w:ascii="Courier New" w:hAnsi="Courier New" w:cs="Courier New"/>
+        </w:rPr>
+        <w:t>newnode</w:t>
+      </w:r>
+      <w:proofErr w:type="spellEnd"/>
+      <w:r>
+        <w:rPr>
+          <w:rFonts w:ascii="Courier New" w:hAnsi="Courier New" w:cs="Courier New"/>
+        </w:rPr>
+        <w:t>;</w:t>
+      </w:r>
+    </w:p>
+    <w:p>
+      <w:pPr>
+        <w:pStyle w:val="PlainText"/>
+        <w:rPr>
+          <w:rFonts w:ascii="Courier New" w:hAnsi="Courier New" w:cs="Courier New"/>
+        </w:rPr>
+      </w:pPr>
+      <w:r>
+        <w:rPr>
+          <w:rFonts w:ascii="Courier New" w:hAnsi="Courier New" w:cs="Courier New"/>
+        </w:rPr>
+        <w:t xml:space="preserve">            tail-&gt;next = head;</w:t>
+      </w:r>
+    </w:p>
+    <w:p>
+      <w:pPr>
+        <w:pStyle w:val="PlainText"/>
+        <w:rPr>
+          <w:rFonts w:ascii="Courier New" w:hAnsi="Courier New" w:cs="Courier New"/>
+        </w:rPr>
+      </w:pPr>
+      <w:r>
+        <w:rPr>
+          <w:rFonts w:ascii="Courier New" w:hAnsi="Courier New" w:cs="Courier New"/>
+        </w:rPr>
+        <w:t xml:space="preserve">        }</w:t>
+      </w:r>
+    </w:p>
+    <w:p>
+      <w:pPr>
+        <w:pStyle w:val="PlainText"/>
+        <w:rPr>
+          <w:rFonts w:ascii="Courier New" w:hAnsi="Courier New" w:cs="Courier New"/>
+        </w:rPr>
+      </w:pPr>
+      <w:r>
+        <w:rPr>
+          <w:rFonts w:ascii="Courier New" w:hAnsi="Courier New" w:cs="Courier New"/>
+        </w:rPr>
+        <w:t xml:space="preserve">        else{</w:t>
+      </w:r>
+    </w:p>
+    <w:p>
+      <w:pPr>
+        <w:pStyle w:val="PlainText"/>
+        <w:rPr>
+          <w:rFonts w:ascii="Courier New" w:hAnsi="Courier New" w:cs="Courier New"/>
+        </w:rPr>
+      </w:pPr>
+      <w:r>
+        <w:rPr>
+          <w:rFonts w:ascii="Courier New" w:hAnsi="Courier New" w:cs="Courier New"/>
+        </w:rPr>
+        <w:t xml:space="preserve">            </w:t>
+      </w:r>
+      <w:proofErr w:type="spellStart"/>
+      <w:r>
+        <w:rPr>
+          <w:rFonts w:ascii="Courier New" w:hAnsi="Courier New" w:cs="Courier New"/>
+        </w:rPr>
+        <w:t>newnode</w:t>
+      </w:r>
+      <w:proofErr w:type="spellEnd"/>
+      <w:r>
+        <w:rPr>
+          <w:rFonts w:ascii="Courier New" w:hAnsi="Courier New" w:cs="Courier New"/>
+        </w:rPr>
+        <w:t>-&gt;next = head;</w:t>
+      </w:r>
+    </w:p>
+    <w:p>
+      <w:pPr>
+        <w:pStyle w:val="PlainText"/>
+        <w:rPr>
+          <w:rFonts w:ascii="Courier New" w:hAnsi="Courier New" w:cs="Courier New"/>
+        </w:rPr>
+      </w:pPr>
+      <w:r>
+        <w:rPr>
+          <w:rFonts w:ascii="Courier New" w:hAnsi="Courier New" w:cs="Courier New"/>
+        </w:rPr>
+        <w:t xml:space="preserve">            head = </w:t>
+      </w:r>
+      <w:proofErr w:type="spellStart"/>
+      <w:r>
+        <w:rPr>
+          <w:rFonts w:ascii="Courier New" w:hAnsi="Courier New" w:cs="Courier New"/>
+        </w:rPr>
+        <w:t>newnode</w:t>
+      </w:r>
+      <w:proofErr w:type="spellEnd"/>
+      <w:r>
+        <w:rPr>
+          <w:rFonts w:ascii="Courier New" w:hAnsi="Courier New" w:cs="Courier New"/>
+        </w:rPr>
+        <w:t>;</w:t>
+      </w:r>
+    </w:p>
+    <w:p>
+      <w:pPr>
+        <w:pStyle w:val="PlainText"/>
+        <w:rPr>
+          <w:rFonts w:ascii="Courier New" w:hAnsi="Courier New" w:cs="Courier New"/>
+        </w:rPr>
+      </w:pPr>
+      <w:r>
+        <w:rPr>
+          <w:rFonts w:ascii="Courier New" w:hAnsi="Courier New" w:cs="Courier New"/>
+        </w:rPr>
+        <w:t xml:space="preserve">            tail-&gt;next = head;</w:t>
+      </w:r>
+    </w:p>
+    <w:p>
+      <w:pPr>
+        <w:pStyle w:val="PlainText"/>
+        <w:rPr>
+          <w:rFonts w:ascii="Courier New" w:hAnsi="Courier New" w:cs="Courier New"/>
+        </w:rPr>
+      </w:pPr>
+      <w:r>
+        <w:rPr>
+          <w:rFonts w:ascii="Courier New" w:hAnsi="Courier New" w:cs="Courier New"/>
+        </w:rPr>
+        <w:t xml:space="preserve">        }</w:t>
+      </w:r>
+    </w:p>
+    <w:p>
+      <w:pPr>
+        <w:pStyle w:val="PlainText"/>
+        <w:rPr>
+          <w:rFonts w:ascii="Courier New" w:hAnsi="Courier New" w:cs="Courier New"/>
+        </w:rPr>
+      </w:pPr>
+      <w:r>
+        <w:rPr>
+          <w:rFonts w:ascii="Courier New" w:hAnsi="Courier New" w:cs="Courier New"/>
+        </w:rPr>
+        <w:lastRenderedPageBreak/>
+        <w:t xml:space="preserve">    }</w:t>
+      </w:r>
+    </w:p>
+    <w:p>
+      <w:pPr>
+        <w:pStyle w:val="PlainText"/>
+        <w:rPr>
+          <w:rFonts w:ascii="Courier New" w:hAnsi="Courier New" w:cs="Courier New"/>
+        </w:rPr>
+      </w:pPr>
+    </w:p>
+    <w:p>
+      <w:pPr>
+        <w:pStyle w:val="PlainText"/>
+        <w:rPr>
+          <w:rFonts w:ascii="Courier New" w:hAnsi="Courier New" w:cs="Courier New"/>
+        </w:rPr>
+      </w:pPr>
+      <w:r>
+        <w:rPr>
+          <w:rFonts w:ascii="Courier New" w:hAnsi="Courier New" w:cs="Courier New"/>
+        </w:rPr>
+        <w:t xml:space="preserve">    void </w:t>
+      </w:r>
+      <w:proofErr w:type="spellStart"/>
+      <w:r>
+        <w:rPr>
+          <w:rFonts w:ascii="Courier New" w:hAnsi="Courier New" w:cs="Courier New"/>
+        </w:rPr>
+        <w:t>insertPos</w:t>
+      </w:r>
+      <w:proofErr w:type="spellEnd"/>
+      <w:r>
+        <w:rPr>
+          <w:rFonts w:ascii="Courier New" w:hAnsi="Courier New" w:cs="Courier New"/>
+        </w:rPr>
+        <w:t xml:space="preserve">(int </w:t>
+      </w:r>
+      <w:proofErr w:type="spellStart"/>
+      <w:r>
+        <w:rPr>
+          <w:rFonts w:ascii="Courier New" w:hAnsi="Courier New" w:cs="Courier New"/>
+        </w:rPr>
+        <w:t>val</w:t>
+      </w:r>
+      <w:proofErr w:type="spellEnd"/>
+      <w:r>
+        <w:rPr>
+          <w:rFonts w:ascii="Courier New" w:hAnsi="Courier New" w:cs="Courier New"/>
+        </w:rPr>
+        <w:t>, int pos){</w:t>
+      </w:r>
+    </w:p>
+    <w:p>
+      <w:pPr>
+        <w:pStyle w:val="PlainText"/>
+        <w:rPr>
+          <w:rFonts w:ascii="Courier New" w:hAnsi="Courier New" w:cs="Courier New"/>
+        </w:rPr>
+      </w:pPr>
+      <w:r>
+        <w:rPr>
+          <w:rFonts w:ascii="Courier New" w:hAnsi="Courier New" w:cs="Courier New"/>
+        </w:rPr>
+        <w:t xml:space="preserve">        if(pos &lt; 1){</w:t>
+      </w:r>
+    </w:p>
+    <w:p>
+      <w:pPr>
+        <w:pStyle w:val="PlainText"/>
+        <w:rPr>
+          <w:rFonts w:ascii="Courier New" w:hAnsi="Courier New" w:cs="Courier New"/>
+        </w:rPr>
+      </w:pPr>
+      <w:r>
+        <w:rPr>
+          <w:rFonts w:ascii="Courier New" w:hAnsi="Courier New" w:cs="Courier New"/>
+        </w:rPr>
+        <w:t xml:space="preserve">            </w:t>
+      </w:r>
+      <w:proofErr w:type="spellStart"/>
+      <w:r>
+        <w:rPr>
+          <w:rFonts w:ascii="Courier New" w:hAnsi="Courier New" w:cs="Courier New"/>
+        </w:rPr>
+        <w:t>cout</w:t>
+      </w:r>
+      <w:proofErr w:type="spellEnd"/>
+      <w:r>
+        <w:rPr>
+          <w:rFonts w:ascii="Courier New" w:hAnsi="Courier New" w:cs="Courier New"/>
+        </w:rPr>
+        <w:t xml:space="preserve"> &lt;&lt; "Invalid pos" &lt;&lt; </w:t>
+      </w:r>
+      <w:proofErr w:type="spellStart"/>
+      <w:r>
+        <w:rPr>
+          <w:rFonts w:ascii="Courier New" w:hAnsi="Courier New" w:cs="Courier New"/>
+        </w:rPr>
+        <w:t>endl</w:t>
+      </w:r>
+      <w:proofErr w:type="spellEnd"/>
+      <w:r>
+        <w:rPr>
+          <w:rFonts w:ascii="Courier New" w:hAnsi="Courier New" w:cs="Courier New"/>
+        </w:rPr>
+        <w:t>;</w:t>
+      </w:r>
+    </w:p>
+    <w:p>
+      <w:pPr>
+        <w:pStyle w:val="PlainText"/>
+        <w:rPr>
+          <w:rFonts w:ascii="Courier New" w:hAnsi="Courier New" w:cs="Courier New"/>
+        </w:rPr>
+      </w:pPr>
+      <w:r>
+        <w:rPr>
+          <w:rFonts w:ascii="Courier New" w:hAnsi="Courier New" w:cs="Courier New"/>
+        </w:rPr>
+        <w:t xml:space="preserve">            return;</w:t>
+      </w:r>
+    </w:p>
+    <w:p>
+      <w:pPr>
+        <w:pStyle w:val="PlainText"/>
+        <w:rPr>
+          <w:rFonts w:ascii="Courier New" w:hAnsi="Courier New" w:cs="Courier New"/>
+        </w:rPr>
+      </w:pPr>
+      <w:r>
+        <w:rPr>
+          <w:rFonts w:ascii="Courier New" w:hAnsi="Courier New" w:cs="Courier New"/>
+        </w:rPr>
+        <w:t xml:space="preserve">        }</w:t>
+      </w:r>
+    </w:p>
+    <w:p>
+      <w:pPr>
+        <w:pStyle w:val="PlainText"/>
+        <w:rPr>
+          <w:rFonts w:ascii="Courier New" w:hAnsi="Courier New" w:cs="Courier New"/>
+        </w:rPr>
+      </w:pPr>
+    </w:p>
+    <w:p>
+      <w:pPr>
+        <w:pStyle w:val="PlainText"/>
+        <w:rPr>
+          <w:rFonts w:ascii="Courier New" w:hAnsi="Courier New" w:cs="Courier New"/>
+        </w:rPr>
+      </w:pPr>
+      <w:r>
+        <w:rPr>
+          <w:rFonts w:ascii="Courier New" w:hAnsi="Courier New" w:cs="Courier New"/>
+        </w:rPr>
+        <w:t xml:space="preserve">        if(pos == 1){</w:t>
+      </w:r>
+    </w:p>
+    <w:p>
+      <w:pPr>
+        <w:pStyle w:val="PlainText"/>
+        <w:rPr>
+          <w:rFonts w:ascii="Courier New" w:hAnsi="Courier New" w:cs="Courier New"/>
+        </w:rPr>
+      </w:pPr>
+      <w:r>
+        <w:rPr>
+          <w:rFonts w:ascii="Courier New" w:hAnsi="Courier New" w:cs="Courier New"/>
+        </w:rPr>
+        <w:t xml:space="preserve">            </w:t>
+      </w:r>
+      <w:proofErr w:type="spellStart"/>
+      <w:r>
+        <w:rPr>
+          <w:rFonts w:ascii="Courier New" w:hAnsi="Courier New" w:cs="Courier New"/>
+        </w:rPr>
+        <w:t>insertBeg</w:t>
+      </w:r>
+      <w:proofErr w:type="spellEnd"/>
+      <w:r>
+        <w:rPr>
+          <w:rFonts w:ascii="Courier New" w:hAnsi="Courier New" w:cs="Courier New"/>
+        </w:rPr>
+        <w:t>(</w:t>
+      </w:r>
+      <w:proofErr w:type="spellStart"/>
+      <w:r>
+        <w:rPr>
+          <w:rFonts w:ascii="Courier New" w:hAnsi="Courier New" w:cs="Courier New"/>
+        </w:rPr>
+        <w:t>val</w:t>
+      </w:r>
+      <w:proofErr w:type="spellEnd"/>
+      <w:r>
+        <w:rPr>
+          <w:rFonts w:ascii="Courier New" w:hAnsi="Courier New" w:cs="Courier New"/>
+        </w:rPr>
+        <w:t>);</w:t>
+      </w:r>
+    </w:p>
+    <w:p>
+      <w:pPr>
+        <w:pStyle w:val="PlainText"/>
+        <w:rPr>
+          <w:rFonts w:ascii="Courier New" w:hAnsi="Courier New" w:cs="Courier New"/>
+        </w:rPr>
+      </w:pPr>
+      <w:r>
+        <w:rPr>
+          <w:rFonts w:ascii="Courier New" w:hAnsi="Courier New" w:cs="Courier New"/>
+        </w:rPr>
+        <w:t xml:space="preserve">            return;</w:t>
+      </w:r>
+    </w:p>
+    <w:p>
+      <w:pPr>
+        <w:pStyle w:val="PlainText"/>
+        <w:rPr>
+          <w:rFonts w:ascii="Courier New" w:hAnsi="Courier New" w:cs="Courier New"/>
+        </w:rPr>
+      </w:pPr>
+      <w:r>
+        <w:rPr>
+          <w:rFonts w:ascii="Courier New" w:hAnsi="Courier New" w:cs="Courier New"/>
+        </w:rPr>
+        <w:t xml:space="preserve">        }</w:t>
+      </w:r>
+    </w:p>
+    <w:p>
+      <w:pPr>
+        <w:pStyle w:val="PlainText"/>
+        <w:rPr>
+          <w:rFonts w:ascii="Courier New" w:hAnsi="Courier New" w:cs="Courier New"/>
+        </w:rPr>
+      </w:pPr>
+    </w:p>
+    <w:p>
+      <w:pPr>
+        <w:pStyle w:val="PlainText"/>
+        <w:rPr>
+          <w:rFonts w:ascii="Courier New" w:hAnsi="Courier New" w:cs="Courier New"/>
+        </w:rPr>
+      </w:pPr>
+      <w:r>
+        <w:rPr>
+          <w:rFonts w:ascii="Courier New" w:hAnsi="Courier New" w:cs="Courier New"/>
+        </w:rPr>
+        <w:t xml:space="preserve">        Node* </w:t>
+      </w:r>
+      <w:proofErr w:type="spellStart"/>
+      <w:r>
+        <w:rPr>
+          <w:rFonts w:ascii="Courier New" w:hAnsi="Courier New" w:cs="Courier New"/>
+        </w:rPr>
+        <w:t>curr</w:t>
+      </w:r>
+      <w:proofErr w:type="spellEnd"/>
+      <w:r>
+        <w:rPr>
+          <w:rFonts w:ascii="Courier New" w:hAnsi="Courier New" w:cs="Courier New"/>
+        </w:rPr>
+        <w:t xml:space="preserve"> = head;</w:t>
+      </w:r>
+    </w:p>
+    <w:p>
+      <w:pPr>
+        <w:pStyle w:val="PlainText"/>
+        <w:rPr>
+          <w:rFonts w:ascii="Courier New" w:hAnsi="Courier New" w:cs="Courier New"/>
+        </w:rPr>
+      </w:pPr>
+    </w:p>
+    <w:p>
+      <w:pPr>
+        <w:pStyle w:val="PlainText"/>
+        <w:rPr>
+          <w:rFonts w:ascii="Courier New" w:hAnsi="Courier New" w:cs="Courier New"/>
+        </w:rPr>
+      </w:pPr>
+      <w:r>
+        <w:rPr>
+          <w:rFonts w:ascii="Courier New" w:hAnsi="Courier New" w:cs="Courier New"/>
+        </w:rPr>
+        <w:t xml:space="preserve">        for(int </w:t>
+      </w:r>
+      <w:proofErr w:type="spellStart"/>
+      <w:r>
+        <w:rPr>
+          <w:rFonts w:ascii="Courier New" w:hAnsi="Courier New" w:cs="Courier New"/>
+        </w:rPr>
+        <w:t>i</w:t>
+      </w:r>
+      <w:proofErr w:type="spellEnd"/>
+      <w:r>
+        <w:rPr>
+          <w:rFonts w:ascii="Courier New" w:hAnsi="Courier New" w:cs="Courier New"/>
+        </w:rPr>
+        <w:t xml:space="preserve">=1; </w:t>
+      </w:r>
+      <w:proofErr w:type="spellStart"/>
+      <w:r>
+        <w:rPr>
+          <w:rFonts w:ascii="Courier New" w:hAnsi="Courier New" w:cs="Courier New"/>
+        </w:rPr>
+        <w:t>i</w:t>
+      </w:r>
+      <w:proofErr w:type="spellEnd"/>
+      <w:r>
+        <w:rPr>
+          <w:rFonts w:ascii="Courier New" w:hAnsi="Courier New" w:cs="Courier New"/>
+        </w:rPr>
+        <w:t xml:space="preserve">&lt;pos-1; </w:t>
+      </w:r>
+      <w:proofErr w:type="spellStart"/>
+      <w:r>
+        <w:rPr>
+          <w:rFonts w:ascii="Courier New" w:hAnsi="Courier New" w:cs="Courier New"/>
+        </w:rPr>
+        <w:t>i</w:t>
+      </w:r>
+      <w:proofErr w:type="spellEnd"/>
+      <w:r>
+        <w:rPr>
+          <w:rFonts w:ascii="Courier New" w:hAnsi="Courier New" w:cs="Courier New"/>
+        </w:rPr>
+        <w:t>++){</w:t>
+      </w:r>
+    </w:p>
+    <w:p>
+      <w:pPr>
+        <w:pStyle w:val="PlainText"/>
+        <w:rPr>
+          <w:rFonts w:ascii="Courier New" w:hAnsi="Courier New" w:cs="Courier New"/>
+        </w:rPr>
+      </w:pPr>
+      <w:r>
+        <w:rPr>
+          <w:rFonts w:ascii="Courier New" w:hAnsi="Courier New" w:cs="Courier New"/>
+        </w:rPr>
+        <w:t xml:space="preserve">            </w:t>
+      </w:r>
+      <w:proofErr w:type="spellStart"/>
+      <w:r>
+        <w:rPr>
+          <w:rFonts w:ascii="Courier New" w:hAnsi="Courier New" w:cs="Courier New"/>
+        </w:rPr>
+        <w:t>curr</w:t>
+      </w:r>
+      <w:proofErr w:type="spellEnd"/>
+      <w:r>
+        <w:rPr>
+          <w:rFonts w:ascii="Courier New" w:hAnsi="Courier New" w:cs="Courier New"/>
+        </w:rPr>
+        <w:t xml:space="preserve"> = </w:t>
+      </w:r>
+      <w:proofErr w:type="spellStart"/>
+      <w:r>
+        <w:rPr>
+          <w:rFonts w:ascii="Courier New" w:hAnsi="Courier New" w:cs="Courier New"/>
+        </w:rPr>
+        <w:t>curr</w:t>
+      </w:r>
+      <w:proofErr w:type="spellEnd"/>
+      <w:r>
+        <w:rPr>
+          <w:rFonts w:ascii="Courier New" w:hAnsi="Courier New" w:cs="Courier New"/>
+        </w:rPr>
+        <w:t>-&gt;next;</w:t>
+      </w:r>
+    </w:p>
+    <w:p>
+      <w:pPr>
+        <w:pStyle w:val="PlainText"/>
+        <w:rPr>
+          <w:rFonts w:ascii="Courier New" w:hAnsi="Courier New" w:cs="Courier New"/>
+        </w:rPr>
+      </w:pPr>
+    </w:p>
+    <w:p>
+      <w:pPr>
+        <w:pStyle w:val="PlainText"/>
+        <w:rPr>
+          <w:rFonts w:ascii="Courier New" w:hAnsi="Courier New" w:cs="Courier New"/>
+        </w:rPr>
+      </w:pPr>
+      <w:r>
+        <w:rPr>
+          <w:rFonts w:ascii="Courier New" w:hAnsi="Courier New" w:cs="Courier New"/>
+        </w:rPr>
+        <w:t xml:space="preserve">            if(</w:t>
+      </w:r>
+      <w:proofErr w:type="spellStart"/>
+      <w:r>
+        <w:rPr>
+          <w:rFonts w:ascii="Courier New" w:hAnsi="Courier New" w:cs="Courier New"/>
+        </w:rPr>
+        <w:t>curr</w:t>
+      </w:r>
+      <w:proofErr w:type="spellEnd"/>
+      <w:r>
+        <w:rPr>
+          <w:rFonts w:ascii="Courier New" w:hAnsi="Courier New" w:cs="Courier New"/>
+        </w:rPr>
+        <w:t xml:space="preserve"> == head){</w:t>
+      </w:r>
+    </w:p>
+    <w:p>
+      <w:pPr>
+        <w:pStyle w:val="PlainText"/>
+        <w:rPr>
+          <w:rFonts w:ascii="Courier New" w:hAnsi="Courier New" w:cs="Courier New"/>
+        </w:rPr>
+      </w:pPr>
+      <w:r>
+        <w:rPr>
+          <w:rFonts w:ascii="Courier New" w:hAnsi="Courier New" w:cs="Courier New"/>
+        </w:rPr>
+        <w:t xml:space="preserve">                </w:t>
+      </w:r>
+      <w:proofErr w:type="spellStart"/>
+      <w:r>
+        <w:rPr>
+          <w:rFonts w:ascii="Courier New" w:hAnsi="Courier New" w:cs="Courier New"/>
+        </w:rPr>
+        <w:t>cout</w:t>
+      </w:r>
+      <w:proofErr w:type="spellEnd"/>
+      <w:r>
+        <w:rPr>
+          <w:rFonts w:ascii="Courier New" w:hAnsi="Courier New" w:cs="Courier New"/>
+        </w:rPr>
+        <w:t xml:space="preserve"> &lt;&lt; "Position out of bounds" &lt;&lt; </w:t>
+      </w:r>
+      <w:proofErr w:type="spellStart"/>
+      <w:r>
+        <w:rPr>
+          <w:rFonts w:ascii="Courier New" w:hAnsi="Courier New" w:cs="Courier New"/>
+        </w:rPr>
+        <w:t>endl</w:t>
+      </w:r>
+      <w:proofErr w:type="spellEnd"/>
+      <w:r>
+        <w:rPr>
+          <w:rFonts w:ascii="Courier New" w:hAnsi="Courier New" w:cs="Courier New"/>
+        </w:rPr>
+        <w:t>;</w:t>
+      </w:r>
+    </w:p>
+    <w:p>
+      <w:pPr>
+        <w:pStyle w:val="PlainText"/>
+        <w:rPr>
+          <w:rFonts w:ascii="Courier New" w:hAnsi="Courier New" w:cs="Courier New"/>
+        </w:rPr>
+      </w:pPr>
+      <w:r>
+        <w:rPr>
+          <w:rFonts w:ascii="Courier New" w:hAnsi="Courier New" w:cs="Courier New"/>
+        </w:rPr>
+        <w:t xml:space="preserve">                return;</w:t>
+      </w:r>
+    </w:p>
+    <w:p>
+      <w:pPr>
+        <w:pStyle w:val="PlainText"/>
+        <w:rPr>
+          <w:rFonts w:ascii="Courier New" w:hAnsi="Courier New" w:cs="Courier New"/>
+        </w:rPr>
+      </w:pPr>
+      <w:r>
+        <w:rPr>
+          <w:rFonts w:ascii="Courier New" w:hAnsi="Courier New" w:cs="Courier New"/>
+        </w:rPr>
+        <w:t xml:space="preserve">            }</w:t>
+      </w:r>
+    </w:p>
+    <w:p>
+      <w:pPr>
+        <w:pStyle w:val="PlainText"/>
+        <w:rPr>
+          <w:rFonts w:ascii="Courier New" w:hAnsi="Courier New" w:cs="Courier New"/>
+        </w:rPr>
+      </w:pPr>
+      <w:r>
+        <w:rPr>
+          <w:rFonts w:ascii="Courier New" w:hAnsi="Courier New" w:cs="Courier New"/>
+        </w:rPr>
+        <w:t xml:space="preserve">        }</w:t>
+      </w:r>
+    </w:p>
+    <w:p>
+      <w:pPr>
+        <w:pStyle w:val="PlainText"/>
+        <w:rPr>
+          <w:rFonts w:ascii="Courier New" w:hAnsi="Courier New" w:cs="Courier New"/>
+        </w:rPr>
+      </w:pPr>
+    </w:p>
+    <w:p>
+      <w:pPr>
+        <w:pStyle w:val="PlainText"/>
+        <w:rPr>
+          <w:rFonts w:ascii="Courier New" w:hAnsi="Courier New" w:cs="Courier New"/>
+        </w:rPr>
+      </w:pPr>
+      <w:r>
+        <w:rPr>
+          <w:rFonts w:ascii="Courier New" w:hAnsi="Courier New" w:cs="Courier New"/>
+        </w:rPr>
+        <w:t xml:space="preserve">        Node* </w:t>
+      </w:r>
+      <w:proofErr w:type="spellStart"/>
+      <w:r>
+        <w:rPr>
+          <w:rFonts w:ascii="Courier New" w:hAnsi="Courier New" w:cs="Courier New"/>
+        </w:rPr>
+        <w:t>newnode</w:t>
+      </w:r>
+      <w:proofErr w:type="spellEnd"/>
+      <w:r>
+        <w:rPr>
+          <w:rFonts w:ascii="Courier New" w:hAnsi="Courier New" w:cs="Courier New"/>
+        </w:rPr>
+        <w:t xml:space="preserve"> = new Node(</w:t>
+      </w:r>
+      <w:proofErr w:type="spellStart"/>
+      <w:r>
+        <w:rPr>
+          <w:rFonts w:ascii="Courier New" w:hAnsi="Courier New" w:cs="Courier New"/>
+        </w:rPr>
+        <w:t>val</w:t>
+      </w:r>
+      <w:proofErr w:type="spellEnd"/>
+      <w:r>
+        <w:rPr>
+          <w:rFonts w:ascii="Courier New" w:hAnsi="Courier New" w:cs="Courier New"/>
+        </w:rPr>
+        <w:t>);</w:t>
+      </w:r>
+    </w:p>
+    <w:p>
+      <w:pPr>
+        <w:pStyle w:val="PlainText"/>
+        <w:rPr>
+          <w:rFonts w:ascii="Courier New" w:hAnsi="Courier New" w:cs="Courier New"/>
+        </w:rPr>
+      </w:pPr>
+      <w:r>
+        <w:rPr>
+          <w:rFonts w:ascii="Courier New" w:hAnsi="Courier New" w:cs="Courier New"/>
+        </w:rPr>
+        <w:t xml:space="preserve">        </w:t>
+      </w:r>
+      <w:proofErr w:type="spellStart"/>
+      <w:r>
+        <w:rPr>
+          <w:rFonts w:ascii="Courier New" w:hAnsi="Courier New" w:cs="Courier New"/>
+        </w:rPr>
+        <w:t>newnode</w:t>
+      </w:r>
+      <w:proofErr w:type="spellEnd"/>
+      <w:r>
+        <w:rPr>
+          <w:rFonts w:ascii="Courier New" w:hAnsi="Courier New" w:cs="Courier New"/>
+        </w:rPr>
+        <w:t xml:space="preserve">-&gt;next = </w:t>
+      </w:r>
+      <w:proofErr w:type="spellStart"/>
+      <w:r>
+        <w:rPr>
+          <w:rFonts w:ascii="Courier New" w:hAnsi="Courier New" w:cs="Courier New"/>
+        </w:rPr>
+        <w:t>curr</w:t>
+      </w:r>
+      <w:proofErr w:type="spellEnd"/>
+      <w:r>
+        <w:rPr>
+          <w:rFonts w:ascii="Courier New" w:hAnsi="Courier New" w:cs="Courier New"/>
+        </w:rPr>
+        <w:t>-&gt;next;</w:t>
+      </w:r>
+    </w:p>
+    <w:p>
+      <w:pPr>
+        <w:pStyle w:val="PlainText"/>
+        <w:rPr>
+          <w:rFonts w:ascii="Courier New" w:hAnsi="Courier New" w:cs="Courier New"/>
+        </w:rPr>
+      </w:pPr>
+      <w:r>
+        <w:rPr>
+          <w:rFonts w:ascii="Courier New" w:hAnsi="Courier New" w:cs="Courier New"/>
+        </w:rPr>
+        <w:t xml:space="preserve">        </w:t>
+      </w:r>
+      <w:proofErr w:type="spellStart"/>
+      <w:r>
+        <w:rPr>
+          <w:rFonts w:ascii="Courier New" w:hAnsi="Courier New" w:cs="Courier New"/>
+        </w:rPr>
+        <w:t>curr</w:t>
+      </w:r>
+      <w:proofErr w:type="spellEnd"/>
+      <w:r>
+        <w:rPr>
+          <w:rFonts w:ascii="Courier New" w:hAnsi="Courier New" w:cs="Courier New"/>
+        </w:rPr>
+        <w:t xml:space="preserve">-&gt;next = </w:t>
+      </w:r>
+      <w:proofErr w:type="spellStart"/>
+      <w:r>
+        <w:rPr>
+          <w:rFonts w:ascii="Courier New" w:hAnsi="Courier New" w:cs="Courier New"/>
+        </w:rPr>
+        <w:t>newnode</w:t>
+      </w:r>
+      <w:proofErr w:type="spellEnd"/>
+      <w:r>
+        <w:rPr>
+          <w:rFonts w:ascii="Courier New" w:hAnsi="Courier New" w:cs="Courier New"/>
+        </w:rPr>
+        <w:t>;</w:t>
+      </w:r>
+    </w:p>
+    <w:p>
+      <w:pPr>
+        <w:pStyle w:val="PlainText"/>
+        <w:rPr>
+          <w:rFonts w:ascii="Courier New" w:hAnsi="Courier New" w:cs="Courier New"/>
+        </w:rPr>
+      </w:pPr>
+    </w:p>
+    <w:p>
+      <w:pPr>
+        <w:pStyle w:val="PlainText"/>
+        <w:rPr>
+          <w:rFonts w:ascii="Courier New" w:hAnsi="Courier New" w:cs="Courier New"/>
+        </w:rPr>
+      </w:pPr>
+      <w:r>
+        <w:rPr>
+          <w:rFonts w:ascii="Courier New" w:hAnsi="Courier New" w:cs="Courier New"/>
+        </w:rPr>
+        <w:t xml:space="preserve">        if(</w:t>
+      </w:r>
+      <w:proofErr w:type="spellStart"/>
+      <w:r>
+        <w:rPr>
+          <w:rFonts w:ascii="Courier New" w:hAnsi="Courier New" w:cs="Courier New"/>
+        </w:rPr>
+        <w:t>curr</w:t>
+      </w:r>
+      <w:proofErr w:type="spellEnd"/>
+      <w:r>
+        <w:rPr>
+          <w:rFonts w:ascii="Courier New" w:hAnsi="Courier New" w:cs="Courier New"/>
+        </w:rPr>
+        <w:t xml:space="preserve"> == tail){</w:t>
+      </w:r>
+    </w:p>
+    <w:p>
+      <w:pPr>
+        <w:pStyle w:val="PlainText"/>
+        <w:rPr>
+          <w:rFonts w:ascii="Courier New" w:hAnsi="Courier New" w:cs="Courier New"/>
+        </w:rPr>
+      </w:pPr>
+      <w:r>
+        <w:rPr>
+          <w:rFonts w:ascii="Courier New" w:hAnsi="Courier New" w:cs="Courier New"/>
+        </w:rPr>
+        <w:t xml:space="preserve">            tail = </w:t>
+      </w:r>
+      <w:proofErr w:type="spellStart"/>
+      <w:r>
+        <w:rPr>
+          <w:rFonts w:ascii="Courier New" w:hAnsi="Courier New" w:cs="Courier New"/>
+        </w:rPr>
+        <w:t>newnode</w:t>
+      </w:r>
+      <w:proofErr w:type="spellEnd"/>
+      <w:r>
+        <w:rPr>
+          <w:rFonts w:ascii="Courier New" w:hAnsi="Courier New" w:cs="Courier New"/>
+        </w:rPr>
+        <w:t>;</w:t>
+      </w:r>
+    </w:p>
+    <w:p>
+      <w:pPr>
+        <w:pStyle w:val="PlainText"/>
+        <w:rPr>
+          <w:rFonts w:ascii="Courier New" w:hAnsi="Courier New" w:cs="Courier New"/>
+        </w:rPr>
+      </w:pPr>
+      <w:r>
+        <w:rPr>
+          <w:rFonts w:ascii="Courier New" w:hAnsi="Courier New" w:cs="Courier New"/>
+        </w:rPr>
+        <w:t xml:space="preserve">        }</w:t>
+      </w:r>
+    </w:p>
+    <w:p>
+      <w:pPr>
+        <w:pStyle w:val="PlainText"/>
+        <w:rPr>
+          <w:rFonts w:ascii="Courier New" w:hAnsi="Courier New" w:cs="Courier New"/>
+        </w:rPr>
+      </w:pPr>
+      <w:r>
+        <w:rPr>
+          <w:rFonts w:ascii="Courier New" w:hAnsi="Courier New" w:cs="Courier New"/>
+        </w:rPr>
+        <w:t xml:space="preserve">    }</w:t>
+      </w:r>
+    </w:p>
+    <w:p>
+      <w:pPr>
+        <w:pStyle w:val="PlainText"/>
+        <w:rPr>
+          <w:rFonts w:ascii="Courier New" w:hAnsi="Courier New" w:cs="Courier New"/>
+        </w:rPr>
+      </w:pPr>
+    </w:p>
+    <w:p>
+      <w:pPr>
+        <w:pStyle w:val="PlainText"/>
+        <w:rPr>
+          <w:rFonts w:ascii="Courier New" w:hAnsi="Courier New" w:cs="Courier New"/>
+        </w:rPr>
+      </w:pPr>
+      <w:r>
+        <w:rPr>
+          <w:rFonts w:ascii="Courier New" w:hAnsi="Courier New" w:cs="Courier New"/>
+        </w:rPr>
+        <w:t xml:space="preserve">    void </w:t>
+      </w:r>
+      <w:proofErr w:type="spellStart"/>
+      <w:r>
+        <w:rPr>
+          <w:rFonts w:ascii="Courier New" w:hAnsi="Courier New" w:cs="Courier New"/>
+        </w:rPr>
+        <w:t>deleteNode</w:t>
+      </w:r>
+      <w:proofErr w:type="spellEnd"/>
+      <w:r>
+        <w:rPr>
+          <w:rFonts w:ascii="Courier New" w:hAnsi="Courier New" w:cs="Courier New"/>
+        </w:rPr>
+        <w:t>(int pos){</w:t>
+      </w:r>
+    </w:p>
+    <w:p>
+      <w:pPr>
+        <w:pStyle w:val="PlainText"/>
+        <w:rPr>
+          <w:rFonts w:ascii="Courier New" w:hAnsi="Courier New" w:cs="Courier New"/>
+        </w:rPr>
+      </w:pPr>
+      <w:r>
+        <w:rPr>
+          <w:rFonts w:ascii="Courier New" w:hAnsi="Courier New" w:cs="Courier New"/>
+        </w:rPr>
+        <w:t xml:space="preserve">        if(head == NULL){</w:t>
+      </w:r>
+    </w:p>
+    <w:p>
+      <w:pPr>
+        <w:pStyle w:val="PlainText"/>
+        <w:rPr>
+          <w:rFonts w:ascii="Courier New" w:hAnsi="Courier New" w:cs="Courier New"/>
+        </w:rPr>
+      </w:pPr>
+      <w:r>
+        <w:rPr>
+          <w:rFonts w:ascii="Courier New" w:hAnsi="Courier New" w:cs="Courier New"/>
+        </w:rPr>
+        <w:t xml:space="preserve">            </w:t>
+      </w:r>
+      <w:proofErr w:type="spellStart"/>
+      <w:r>
+        <w:rPr>
+          <w:rFonts w:ascii="Courier New" w:hAnsi="Courier New" w:cs="Courier New"/>
+        </w:rPr>
+        <w:t>cout</w:t>
+      </w:r>
+      <w:proofErr w:type="spellEnd"/>
+      <w:r>
+        <w:rPr>
+          <w:rFonts w:ascii="Courier New" w:hAnsi="Courier New" w:cs="Courier New"/>
+        </w:rPr>
+        <w:t xml:space="preserve"> &lt;&lt; "List is empty" &lt;&lt; </w:t>
+      </w:r>
+      <w:proofErr w:type="spellStart"/>
+      <w:r>
+        <w:rPr>
+          <w:rFonts w:ascii="Courier New" w:hAnsi="Courier New" w:cs="Courier New"/>
+        </w:rPr>
+        <w:t>endl</w:t>
+      </w:r>
+      <w:proofErr w:type="spellEnd"/>
+      <w:r>
+        <w:rPr>
+          <w:rFonts w:ascii="Courier New" w:hAnsi="Courier New" w:cs="Courier New"/>
+        </w:rPr>
+        <w:t>;</w:t>
+      </w:r>
+    </w:p>
+    <w:p>
+      <w:pPr>
+        <w:pStyle w:val="PlainText"/>
+        <w:rPr>
+          <w:rFonts w:ascii="Courier New" w:hAnsi="Courier New" w:cs="Courier New"/>
+        </w:rPr>
+      </w:pPr>
+      <w:r>
+        <w:rPr>
+          <w:rFonts w:ascii="Courier New" w:hAnsi="Courier New" w:cs="Courier New"/>
+        </w:rPr>
+        <w:t xml:space="preserve">            return;</w:t>
+      </w:r>
+    </w:p>
+    <w:p>
+      <w:pPr>
+        <w:pStyle w:val="PlainText"/>
+        <w:rPr>
+          <w:rFonts w:ascii="Courier New" w:hAnsi="Courier New" w:cs="Courier New"/>
+        </w:rPr>
+      </w:pPr>
+      <w:r>
+        <w:rPr>
+          <w:rFonts w:ascii="Courier New" w:hAnsi="Courier New" w:cs="Courier New"/>
+        </w:rPr>
+        <w:t xml:space="preserve">        }</w:t>
+      </w:r>
+    </w:p>
+    <w:p>
+      <w:pPr>
+        <w:pStyle w:val="PlainText"/>
+        <w:rPr>
+          <w:rFonts w:ascii="Courier New" w:hAnsi="Courier New" w:cs="Courier New"/>
+        </w:rPr>
+      </w:pPr>
+    </w:p>
+    <w:p>
+      <w:pPr>
+        <w:pStyle w:val="PlainText"/>
+        <w:rPr>
+          <w:rFonts w:ascii="Courier New" w:hAnsi="Courier New" w:cs="Courier New"/>
+        </w:rPr>
+      </w:pPr>
+      <w:r>
+        <w:rPr>
+          <w:rFonts w:ascii="Courier New" w:hAnsi="Courier New" w:cs="Courier New"/>
+        </w:rPr>
+        <w:t xml:space="preserve">        if(pos &lt; 1){</w:t>
+      </w:r>
+    </w:p>
+    <w:p>
+      <w:pPr>
+        <w:pStyle w:val="PlainText"/>
+        <w:rPr>
+          <w:rFonts w:ascii="Courier New" w:hAnsi="Courier New" w:cs="Courier New"/>
+        </w:rPr>
+      </w:pPr>
+      <w:r>
+        <w:rPr>
+          <w:rFonts w:ascii="Courier New" w:hAnsi="Courier New" w:cs="Courier New"/>
+        </w:rPr>
+        <w:t xml:space="preserve">            </w:t>
+      </w:r>
+      <w:proofErr w:type="spellStart"/>
+      <w:r>
+        <w:rPr>
+          <w:rFonts w:ascii="Courier New" w:hAnsi="Courier New" w:cs="Courier New"/>
+        </w:rPr>
+        <w:t>cout</w:t>
+      </w:r>
+      <w:proofErr w:type="spellEnd"/>
+      <w:r>
+        <w:rPr>
+          <w:rFonts w:ascii="Courier New" w:hAnsi="Courier New" w:cs="Courier New"/>
+        </w:rPr>
+        <w:t xml:space="preserve"> &lt;&lt; "Invalid pos" &lt;&lt; </w:t>
+      </w:r>
+      <w:proofErr w:type="spellStart"/>
+      <w:r>
+        <w:rPr>
+          <w:rFonts w:ascii="Courier New" w:hAnsi="Courier New" w:cs="Courier New"/>
+        </w:rPr>
+        <w:t>endl</w:t>
+      </w:r>
+      <w:proofErr w:type="spellEnd"/>
+      <w:r>
+        <w:rPr>
+          <w:rFonts w:ascii="Courier New" w:hAnsi="Courier New" w:cs="Courier New"/>
+        </w:rPr>
+        <w:t>;</w:t>
+      </w:r>
+    </w:p>
+    <w:p>
+      <w:pPr>
+        <w:pStyle w:val="PlainText"/>
+        <w:rPr>
+          <w:rFonts w:ascii="Courier New" w:hAnsi="Courier New" w:cs="Courier New"/>
+        </w:rPr>
+      </w:pPr>
+      <w:r>
+        <w:rPr>
+          <w:rFonts w:ascii="Courier New" w:hAnsi="Courier New" w:cs="Courier New"/>
+        </w:rPr>
+        <w:t xml:space="preserve">            return;</w:t>
+      </w:r>
+    </w:p>
+    <w:p>
+      <w:pPr>
+        <w:pStyle w:val="PlainText"/>
+        <w:rPr>
+          <w:rFonts w:ascii="Courier New" w:hAnsi="Courier New" w:cs="Courier New"/>
+        </w:rPr>
+      </w:pPr>
+      <w:r>
+        <w:rPr>
+          <w:rFonts w:ascii="Courier New" w:hAnsi="Courier New" w:cs="Courier New"/>
+        </w:rPr>
+        <w:t xml:space="preserve">        }</w:t>
+      </w:r>
+    </w:p>
+    <w:p>
+      <w:pPr>
+        <w:pStyle w:val="PlainText"/>
+        <w:rPr>
+          <w:rFonts w:ascii="Courier New" w:hAnsi="Courier New" w:cs="Courier New"/>
+        </w:rPr>
+      </w:pPr>
+    </w:p>
+    <w:p>
+      <w:pPr>
+        <w:pStyle w:val="PlainText"/>
+        <w:rPr>
+          <w:rFonts w:ascii="Courier New" w:hAnsi="Courier New" w:cs="Courier New"/>
+        </w:rPr>
+      </w:pPr>
+      <w:r>
+        <w:rPr>
+          <w:rFonts w:ascii="Courier New" w:hAnsi="Courier New" w:cs="Courier New"/>
+        </w:rPr>
+        <w:t xml:space="preserve">        if(pos == 1){</w:t>
+      </w:r>
+    </w:p>
+    <w:p>
+      <w:pPr>
+        <w:pStyle w:val="PlainText"/>
+        <w:rPr>
+          <w:rFonts w:ascii="Courier New" w:hAnsi="Courier New" w:cs="Courier New"/>
+        </w:rPr>
+      </w:pPr>
+      <w:r>
+        <w:rPr>
+          <w:rFonts w:ascii="Courier New" w:hAnsi="Courier New" w:cs="Courier New"/>
+        </w:rPr>
+        <w:t xml:space="preserve">            if(head == tail){</w:t>
+      </w:r>
+    </w:p>
+    <w:p>
+      <w:pPr>
+        <w:pStyle w:val="PlainText"/>
+        <w:rPr>
+          <w:rFonts w:ascii="Courier New" w:hAnsi="Courier New" w:cs="Courier New"/>
+        </w:rPr>
+      </w:pPr>
+      <w:r>
+        <w:rPr>
+          <w:rFonts w:ascii="Courier New" w:hAnsi="Courier New" w:cs="Courier New"/>
+        </w:rPr>
+        <w:t xml:space="preserve">                delete head;</w:t>
+      </w:r>
+    </w:p>
+    <w:p>
+      <w:pPr>
+        <w:pStyle w:val="PlainText"/>
+        <w:rPr>
+          <w:rFonts w:ascii="Courier New" w:hAnsi="Courier New" w:cs="Courier New"/>
+        </w:rPr>
+      </w:pPr>
+      <w:r>
+        <w:rPr>
+          <w:rFonts w:ascii="Courier New" w:hAnsi="Courier New" w:cs="Courier New"/>
+        </w:rPr>
+        <w:t xml:space="preserve">                head = tail = NULL;</w:t>
+      </w:r>
+    </w:p>
+    <w:p>
+      <w:pPr>
+        <w:pStyle w:val="PlainText"/>
+        <w:rPr>
+          <w:rFonts w:ascii="Courier New" w:hAnsi="Courier New" w:cs="Courier New"/>
+        </w:rPr>
+      </w:pPr>
+      <w:r>
+        <w:rPr>
+          <w:rFonts w:ascii="Courier New" w:hAnsi="Courier New" w:cs="Courier New"/>
+        </w:rPr>
+        <w:t xml:space="preserve">            }</w:t>
+      </w:r>
+    </w:p>
+    <w:p>
+      <w:pPr>
+        <w:pStyle w:val="PlainText"/>
+        <w:rPr>
+          <w:rFonts w:ascii="Courier New" w:hAnsi="Courier New" w:cs="Courier New"/>
+        </w:rPr>
+      </w:pPr>
+      <w:r>
+        <w:rPr>
+          <w:rFonts w:ascii="Courier New" w:hAnsi="Courier New" w:cs="Courier New"/>
+        </w:rPr>
+        <w:t xml:space="preserve">            else{</w:t>
+      </w:r>
+    </w:p>
+    <w:p>
+      <w:pPr>
+        <w:pStyle w:val="PlainText"/>
+        <w:rPr>
+          <w:rFonts w:ascii="Courier New" w:hAnsi="Courier New" w:cs="Courier New"/>
+        </w:rPr>
+      </w:pPr>
+      <w:r>
+        <w:rPr>
+          <w:rFonts w:ascii="Courier New" w:hAnsi="Courier New" w:cs="Courier New"/>
+        </w:rPr>
+        <w:t xml:space="preserve">                Node* temp = head;</w:t>
+      </w:r>
+    </w:p>
+    <w:p>
+      <w:pPr>
+        <w:pStyle w:val="PlainText"/>
+        <w:rPr>
+          <w:rFonts w:ascii="Courier New" w:hAnsi="Courier New" w:cs="Courier New"/>
+        </w:rPr>
+      </w:pPr>
+      <w:r>
+        <w:rPr>
+          <w:rFonts w:ascii="Courier New" w:hAnsi="Courier New" w:cs="Courier New"/>
+        </w:rPr>
+        <w:t xml:space="preserve">                head = head-&gt;next;</w:t>
+      </w:r>
+    </w:p>
+    <w:p>
+      <w:pPr>
+        <w:pStyle w:val="PlainText"/>
+        <w:rPr>
+          <w:rFonts w:ascii="Courier New" w:hAnsi="Courier New" w:cs="Courier New"/>
+        </w:rPr>
+      </w:pPr>
+      <w:r>
+        <w:rPr>
+          <w:rFonts w:ascii="Courier New" w:hAnsi="Courier New" w:cs="Courier New"/>
+        </w:rPr>
+        <w:t xml:space="preserve">                tail-&gt;next = head;</w:t>
+      </w:r>
+    </w:p>
+    <w:p>
+      <w:pPr>
+        <w:pStyle w:val="PlainText"/>
+        <w:rPr>
+          <w:rFonts w:ascii="Courier New" w:hAnsi="Courier New" w:cs="Courier New"/>
+        </w:rPr>
+      </w:pPr>
+      <w:r>
+        <w:rPr>
+          <w:rFonts w:ascii="Courier New" w:hAnsi="Courier New" w:cs="Courier New"/>
+        </w:rPr>
+        <w:t xml:space="preserve">                delete temp;</w:t>
+      </w:r>
+    </w:p>
+    <w:p>
+      <w:pPr>
+        <w:pStyle w:val="PlainText"/>
+        <w:rPr>
+          <w:rFonts w:ascii="Courier New" w:hAnsi="Courier New" w:cs="Courier New"/>
+        </w:rPr>
+      </w:pPr>
+      <w:r>
+        <w:rPr>
+          <w:rFonts w:ascii="Courier New" w:hAnsi="Courier New" w:cs="Courier New"/>
+        </w:rPr>
+        <w:lastRenderedPageBreak/>
+        <w:t xml:space="preserve">            }</w:t>
+      </w:r>
+    </w:p>
+    <w:p>
+      <w:pPr>
+        <w:pStyle w:val="PlainText"/>
+        <w:rPr>
+          <w:rFonts w:ascii="Courier New" w:hAnsi="Courier New" w:cs="Courier New"/>
+        </w:rPr>
+      </w:pPr>
+      <w:r>
+        <w:rPr>
+          <w:rFonts w:ascii="Courier New" w:hAnsi="Courier New" w:cs="Courier New"/>
+        </w:rPr>
+        <w:t xml:space="preserve">            return;</w:t>
+      </w:r>
+    </w:p>
+    <w:p>
+      <w:pPr>
+        <w:pStyle w:val="PlainText"/>
+        <w:rPr>
+          <w:rFonts w:ascii="Courier New" w:hAnsi="Courier New" w:cs="Courier New"/>
+        </w:rPr>
+      </w:pPr>
+      <w:r>
+        <w:rPr>
+          <w:rFonts w:ascii="Courier New" w:hAnsi="Courier New" w:cs="Courier New"/>
+        </w:rPr>
+        <w:t xml:space="preserve">        }</w:t>
+      </w:r>
+    </w:p>
+    <w:p>
+      <w:pPr>
+        <w:pStyle w:val="PlainText"/>
+        <w:rPr>
+          <w:rFonts w:ascii="Courier New" w:hAnsi="Courier New" w:cs="Courier New"/>
+        </w:rPr>
+      </w:pPr>
+    </w:p>
+    <w:p>
+      <w:pPr>
+        <w:pStyle w:val="PlainText"/>
+        <w:rPr>
+          <w:rFonts w:ascii="Courier New" w:hAnsi="Courier New" w:cs="Courier New"/>
+        </w:rPr>
+      </w:pPr>
+      <w:r>
+        <w:rPr>
+          <w:rFonts w:ascii="Courier New" w:hAnsi="Courier New" w:cs="Courier New"/>
+        </w:rPr>
+        <w:t xml:space="preserve">        Node* </w:t>
+      </w:r>
+      <w:proofErr w:type="spellStart"/>
+      <w:r>
+        <w:rPr>
+          <w:rFonts w:ascii="Courier New" w:hAnsi="Courier New" w:cs="Courier New"/>
+        </w:rPr>
+        <w:t>curr</w:t>
+      </w:r>
+      <w:proofErr w:type="spellEnd"/>
+      <w:r>
+        <w:rPr>
+          <w:rFonts w:ascii="Courier New" w:hAnsi="Courier New" w:cs="Courier New"/>
+        </w:rPr>
+        <w:t xml:space="preserve"> = head;</w:t>
+      </w:r>
+    </w:p>
+    <w:p>
+      <w:pPr>
+        <w:pStyle w:val="PlainText"/>
+        <w:rPr>
+          <w:rFonts w:ascii="Courier New" w:hAnsi="Courier New" w:cs="Courier New"/>
+        </w:rPr>
+      </w:pPr>
+    </w:p>
+    <w:p>
+      <w:pPr>
+        <w:pStyle w:val="PlainText"/>
+        <w:rPr>
+          <w:rFonts w:ascii="Courier New" w:hAnsi="Courier New" w:cs="Courier New"/>
+        </w:rPr>
+      </w:pPr>
+      <w:r>
+        <w:rPr>
+          <w:rFonts w:ascii="Courier New" w:hAnsi="Courier New" w:cs="Courier New"/>
+        </w:rPr>
+        <w:t xml:space="preserve">        for(int </w:t>
+      </w:r>
+      <w:proofErr w:type="spellStart"/>
+      <w:r>
+        <w:rPr>
+          <w:rFonts w:ascii="Courier New" w:hAnsi="Courier New" w:cs="Courier New"/>
+        </w:rPr>
+        <w:t>i</w:t>
+      </w:r>
+      <w:proofErr w:type="spellEnd"/>
+      <w:r>
+        <w:rPr>
+          <w:rFonts w:ascii="Courier New" w:hAnsi="Courier New" w:cs="Courier New"/>
+        </w:rPr>
+        <w:t xml:space="preserve">=1; </w:t>
+      </w:r>
+      <w:proofErr w:type="spellStart"/>
+      <w:r>
+        <w:rPr>
+          <w:rFonts w:ascii="Courier New" w:hAnsi="Courier New" w:cs="Courier New"/>
+        </w:rPr>
+        <w:t>i</w:t>
+      </w:r>
+      <w:proofErr w:type="spellEnd"/>
+      <w:r>
+        <w:rPr>
+          <w:rFonts w:ascii="Courier New" w:hAnsi="Courier New" w:cs="Courier New"/>
+        </w:rPr>
+        <w:t xml:space="preserve">&lt;pos-1; </w:t>
+      </w:r>
+      <w:proofErr w:type="spellStart"/>
+      <w:r>
+        <w:rPr>
+          <w:rFonts w:ascii="Courier New" w:hAnsi="Courier New" w:cs="Courier New"/>
+        </w:rPr>
+        <w:t>i</w:t>
+      </w:r>
+      <w:proofErr w:type="spellEnd"/>
+      <w:r>
+        <w:rPr>
+          <w:rFonts w:ascii="Courier New" w:hAnsi="Courier New" w:cs="Courier New"/>
+        </w:rPr>
+        <w:t>++){</w:t>
+      </w:r>
+    </w:p>
+    <w:p>
+      <w:pPr>
+        <w:pStyle w:val="PlainText"/>
+        <w:rPr>
+          <w:rFonts w:ascii="Courier New" w:hAnsi="Courier New" w:cs="Courier New"/>
+        </w:rPr>
+      </w:pPr>
+      <w:r>
+        <w:rPr>
+          <w:rFonts w:ascii="Courier New" w:hAnsi="Courier New" w:cs="Courier New"/>
+        </w:rPr>
+        <w:t xml:space="preserve">            </w:t>
+      </w:r>
+      <w:proofErr w:type="spellStart"/>
+      <w:r>
+        <w:rPr>
+          <w:rFonts w:ascii="Courier New" w:hAnsi="Courier New" w:cs="Courier New"/>
+        </w:rPr>
+        <w:t>curr</w:t>
+      </w:r>
+      <w:proofErr w:type="spellEnd"/>
+      <w:r>
+        <w:rPr>
+          <w:rFonts w:ascii="Courier New" w:hAnsi="Courier New" w:cs="Courier New"/>
+        </w:rPr>
+        <w:t xml:space="preserve"> = </w:t>
+      </w:r>
+      <w:proofErr w:type="spellStart"/>
+      <w:r>
+        <w:rPr>
+          <w:rFonts w:ascii="Courier New" w:hAnsi="Courier New" w:cs="Courier New"/>
+        </w:rPr>
+        <w:t>curr</w:t>
+      </w:r>
+      <w:proofErr w:type="spellEnd"/>
+      <w:r>
+        <w:rPr>
+          <w:rFonts w:ascii="Courier New" w:hAnsi="Courier New" w:cs="Courier New"/>
+        </w:rPr>
+        <w:t>-&gt;next;</w:t>
+      </w:r>
+    </w:p>
+    <w:p>
+      <w:pPr>
+        <w:pStyle w:val="PlainText"/>
+        <w:rPr>
+          <w:rFonts w:ascii="Courier New" w:hAnsi="Courier New" w:cs="Courier New"/>
+        </w:rPr>
+      </w:pPr>
+    </w:p>
+    <w:p>
+      <w:pPr>
+        <w:pStyle w:val="PlainText"/>
+        <w:rPr>
+          <w:rFonts w:ascii="Courier New" w:hAnsi="Courier New" w:cs="Courier New"/>
+        </w:rPr>
+      </w:pPr>
+      <w:r>
+        <w:rPr>
+          <w:rFonts w:ascii="Courier New" w:hAnsi="Courier New" w:cs="Courier New"/>
+        </w:rPr>
+        <w:t xml:space="preserve">            if(</w:t>
+      </w:r>
+      <w:proofErr w:type="spellStart"/>
+      <w:r>
+        <w:rPr>
+          <w:rFonts w:ascii="Courier New" w:hAnsi="Courier New" w:cs="Courier New"/>
+        </w:rPr>
+        <w:t>curr</w:t>
+      </w:r>
+      <w:proofErr w:type="spellEnd"/>
+      <w:r>
+        <w:rPr>
+          <w:rFonts w:ascii="Courier New" w:hAnsi="Courier New" w:cs="Courier New"/>
+        </w:rPr>
+        <w:t xml:space="preserve"> == head){</w:t>
+      </w:r>
+    </w:p>
+    <w:p>
+      <w:pPr>
+        <w:pStyle w:val="PlainText"/>
+        <w:rPr>
+          <w:rFonts w:ascii="Courier New" w:hAnsi="Courier New" w:cs="Courier New"/>
+        </w:rPr>
+      </w:pPr>
+      <w:r>
+        <w:rPr>
+          <w:rFonts w:ascii="Courier New" w:hAnsi="Courier New" w:cs="Courier New"/>
+        </w:rPr>
+        <w:t xml:space="preserve">                </w:t>
+      </w:r>
+      <w:proofErr w:type="spellStart"/>
+      <w:r>
+        <w:rPr>
+          <w:rFonts w:ascii="Courier New" w:hAnsi="Courier New" w:cs="Courier New"/>
+        </w:rPr>
+        <w:t>cout</w:t>
+      </w:r>
+      <w:proofErr w:type="spellEnd"/>
+      <w:r>
+        <w:rPr>
+          <w:rFonts w:ascii="Courier New" w:hAnsi="Courier New" w:cs="Courier New"/>
+        </w:rPr>
+        <w:t xml:space="preserve"> &lt;&lt; "Position out of bounds" &lt;&lt; </w:t>
+      </w:r>
+      <w:proofErr w:type="spellStart"/>
+      <w:r>
+        <w:rPr>
+          <w:rFonts w:ascii="Courier New" w:hAnsi="Courier New" w:cs="Courier New"/>
+        </w:rPr>
+        <w:t>endl</w:t>
+      </w:r>
+      <w:proofErr w:type="spellEnd"/>
+      <w:r>
+        <w:rPr>
+          <w:rFonts w:ascii="Courier New" w:hAnsi="Courier New" w:cs="Courier New"/>
+        </w:rPr>
+        <w:t>;</w:t>
+      </w:r>
+    </w:p>
+    <w:p>
+      <w:pPr>
+        <w:pStyle w:val="PlainText"/>
+        <w:rPr>
+          <w:rFonts w:ascii="Courier New" w:hAnsi="Courier New" w:cs="Courier New"/>
+        </w:rPr>
+      </w:pPr>
+      <w:r>
+        <w:rPr>
+          <w:rFonts w:ascii="Courier New" w:hAnsi="Courier New" w:cs="Courier New"/>
+        </w:rPr>
+        <w:t xml:space="preserve">                return;</w:t>
+      </w:r>
+    </w:p>
+    <w:p>
+      <w:pPr>
+        <w:pStyle w:val="PlainText"/>
+        <w:rPr>
+          <w:rFonts w:ascii="Courier New" w:hAnsi="Courier New" w:cs="Courier New"/>
+        </w:rPr>
+      </w:pPr>
+      <w:r>
+        <w:rPr>
+          <w:rFonts w:ascii="Courier New" w:hAnsi="Courier New" w:cs="Courier New"/>
+        </w:rPr>
+        <w:t xml:space="preserve">            }</w:t>
+      </w:r>
+    </w:p>
+    <w:p>
+      <w:pPr>
+        <w:pStyle w:val="PlainText"/>
+        <w:rPr>
+          <w:rFonts w:ascii="Courier New" w:hAnsi="Courier New" w:cs="Courier New"/>
+        </w:rPr>
+      </w:pPr>
+      <w:r>
+        <w:rPr>
+          <w:rFonts w:ascii="Courier New" w:hAnsi="Courier New" w:cs="Courier New"/>
+        </w:rPr>
+        <w:t xml:space="preserve">        }</w:t>
+      </w:r>
+    </w:p>
+    <w:p>
+      <w:pPr>
+        <w:pStyle w:val="PlainText"/>
+        <w:rPr>
+          <w:rFonts w:ascii="Courier New" w:hAnsi="Courier New" w:cs="Courier New"/>
+        </w:rPr>
+      </w:pPr>
+    </w:p>
+    <w:p>
+      <w:pPr>
+        <w:pStyle w:val="PlainText"/>
+        <w:rPr>
+          <w:rFonts w:ascii="Courier New" w:hAnsi="Courier New" w:cs="Courier New"/>
+        </w:rPr>
+      </w:pPr>
+      <w:r>
+        <w:rPr>
+          <w:rFonts w:ascii="Courier New" w:hAnsi="Courier New" w:cs="Courier New"/>
+        </w:rPr>
+        <w:t xml:space="preserve">        Node* temp = </w:t>
+      </w:r>
+      <w:proofErr w:type="spellStart"/>
+      <w:r>
+        <w:rPr>
+          <w:rFonts w:ascii="Courier New" w:hAnsi="Courier New" w:cs="Courier New"/>
+        </w:rPr>
+        <w:t>curr</w:t>
+      </w:r>
+      <w:proofErr w:type="spellEnd"/>
+      <w:r>
+        <w:rPr>
+          <w:rFonts w:ascii="Courier New" w:hAnsi="Courier New" w:cs="Courier New"/>
+        </w:rPr>
+        <w:t>-&gt;next;</w:t>
+      </w:r>
+    </w:p>
+    <w:p>
+      <w:pPr>
+        <w:pStyle w:val="PlainText"/>
+        <w:rPr>
+          <w:rFonts w:ascii="Courier New" w:hAnsi="Courier New" w:cs="Courier New"/>
+        </w:rPr>
+      </w:pPr>
+    </w:p>
+    <w:p>
+      <w:pPr>
+        <w:pStyle w:val="PlainText"/>
+        <w:rPr>
+          <w:rFonts w:ascii="Courier New" w:hAnsi="Courier New" w:cs="Courier New"/>
+        </w:rPr>
+      </w:pPr>
+      <w:r>
+        <w:rPr>
+          <w:rFonts w:ascii="Courier New" w:hAnsi="Courier New" w:cs="Courier New"/>
+        </w:rPr>
+        <w:t xml:space="preserve">        if(temp == head){</w:t>
+      </w:r>
+    </w:p>
+    <w:p>
+      <w:pPr>
+        <w:pStyle w:val="PlainText"/>
+        <w:rPr>
+          <w:rFonts w:ascii="Courier New" w:hAnsi="Courier New" w:cs="Courier New"/>
+        </w:rPr>
+      </w:pPr>
+      <w:r>
+        <w:rPr>
+          <w:rFonts w:ascii="Courier New" w:hAnsi="Courier New" w:cs="Courier New"/>
+        </w:rPr>
+        <w:t xml:space="preserve">            </w:t>
+      </w:r>
+      <w:proofErr w:type="spellStart"/>
+      <w:r>
+        <w:rPr>
+          <w:rFonts w:ascii="Courier New" w:hAnsi="Courier New" w:cs="Courier New"/>
+        </w:rPr>
+        <w:t>cout</w:t>
+      </w:r>
+      <w:proofErr w:type="spellEnd"/>
+      <w:r>
+        <w:rPr>
+          <w:rFonts w:ascii="Courier New" w:hAnsi="Courier New" w:cs="Courier New"/>
+        </w:rPr>
+        <w:t xml:space="preserve"> &lt;&lt; "Position out of bounds" &lt;&lt; </w:t>
+      </w:r>
+      <w:proofErr w:type="spellStart"/>
+      <w:r>
+        <w:rPr>
+          <w:rFonts w:ascii="Courier New" w:hAnsi="Courier New" w:cs="Courier New"/>
+        </w:rPr>
+        <w:t>endl</w:t>
+      </w:r>
+      <w:proofErr w:type="spellEnd"/>
+      <w:r>
+        <w:rPr>
+          <w:rFonts w:ascii="Courier New" w:hAnsi="Courier New" w:cs="Courier New"/>
+        </w:rPr>
+        <w:t>;</w:t>
+      </w:r>
+    </w:p>
+    <w:p>
+      <w:pPr>
+        <w:pStyle w:val="PlainText"/>
+        <w:rPr>
+          <w:rFonts w:ascii="Courier New" w:hAnsi="Courier New" w:cs="Courier New"/>
+        </w:rPr>
+      </w:pPr>
+      <w:r>
+        <w:rPr>
+          <w:rFonts w:ascii="Courier New" w:hAnsi="Courier New" w:cs="Courier New"/>
+        </w:rPr>
+        <w:t xml:space="preserve">            return;</w:t>
+      </w:r>
+    </w:p>
+    <w:p>
+      <w:pPr>
+        <w:pStyle w:val="PlainText"/>
+        <w:rPr>
+          <w:rFonts w:ascii="Courier New" w:hAnsi="Courier New" w:cs="Courier New"/>
+        </w:rPr>
+      </w:pPr>
+      <w:r>
+        <w:rPr>
+          <w:rFonts w:ascii="Courier New" w:hAnsi="Courier New" w:cs="Courier New"/>
+        </w:rPr>
+        <w:t xml:space="preserve">        }</w:t>
+      </w:r>
+    </w:p>
+    <w:p>
+      <w:pPr>
+        <w:pStyle w:val="PlainText"/>
+        <w:rPr>
+          <w:rFonts w:ascii="Courier New" w:hAnsi="Courier New" w:cs="Courier New"/>
+        </w:rPr>
+      </w:pPr>
+    </w:p>
+    <w:p>
+      <w:pPr>
+        <w:pStyle w:val="PlainText"/>
+        <w:rPr>
+          <w:rFonts w:ascii="Courier New" w:hAnsi="Courier New" w:cs="Courier New"/>
+        </w:rPr>
+      </w:pPr>
+      <w:r>
+        <w:rPr>
+          <w:rFonts w:ascii="Courier New" w:hAnsi="Courier New" w:cs="Courier New"/>
+        </w:rPr>
+        <w:t xml:space="preserve">        </w:t>
+      </w:r>
+      <w:proofErr w:type="spellStart"/>
+      <w:r>
+        <w:rPr>
+          <w:rFonts w:ascii="Courier New" w:hAnsi="Courier New" w:cs="Courier New"/>
+        </w:rPr>
+        <w:t>curr</w:t>
+      </w:r>
+      <w:proofErr w:type="spellEnd"/>
+      <w:r>
+        <w:rPr>
+          <w:rFonts w:ascii="Courier New" w:hAnsi="Courier New" w:cs="Courier New"/>
+        </w:rPr>
+        <w:t>-&gt;next = temp-&gt;next;</w:t>
+      </w:r>
+    </w:p>
+    <w:p>
+      <w:pPr>
+        <w:pStyle w:val="PlainText"/>
+        <w:rPr>
+          <w:rFonts w:ascii="Courier New" w:hAnsi="Courier New" w:cs="Courier New"/>
+        </w:rPr>
+      </w:pPr>
+    </w:p>
+    <w:p>
+      <w:pPr>
+        <w:pStyle w:val="PlainText"/>
+        <w:rPr>
+          <w:rFonts w:ascii="Courier New" w:hAnsi="Courier New" w:cs="Courier New"/>
+        </w:rPr>
+      </w:pPr>
+      <w:r>
+        <w:rPr>
+          <w:rFonts w:ascii="Courier New" w:hAnsi="Courier New" w:cs="Courier New"/>
+        </w:rPr>
+        <w:t xml:space="preserve">        if(temp == tail){</w:t>
+      </w:r>
+    </w:p>
+    <w:p>
+      <w:pPr>
+        <w:pStyle w:val="PlainText"/>
+        <w:rPr>
+          <w:rFonts w:ascii="Courier New" w:hAnsi="Courier New" w:cs="Courier New"/>
+        </w:rPr>
+      </w:pPr>
+      <w:r>
+        <w:rPr>
+          <w:rFonts w:ascii="Courier New" w:hAnsi="Courier New" w:cs="Courier New"/>
+        </w:rPr>
+        <w:t xml:space="preserve">            tail = </w:t>
+      </w:r>
+      <w:proofErr w:type="spellStart"/>
+      <w:r>
+        <w:rPr>
+          <w:rFonts w:ascii="Courier New" w:hAnsi="Courier New" w:cs="Courier New"/>
+        </w:rPr>
+        <w:t>curr</w:t>
+      </w:r>
+      <w:proofErr w:type="spellEnd"/>
+      <w:r>
+        <w:rPr>
+          <w:rFonts w:ascii="Courier New" w:hAnsi="Courier New" w:cs="Courier New"/>
+        </w:rPr>
+        <w:t>;</w:t>
+      </w:r>
+    </w:p>
+    <w:p>
+      <w:pPr>
+        <w:pStyle w:val="PlainText"/>
+        <w:rPr>
+          <w:rFonts w:ascii="Courier New" w:hAnsi="Courier New" w:cs="Courier New"/>
+        </w:rPr>
+      </w:pPr>
+      <w:r>
+        <w:rPr>
+          <w:rFonts w:ascii="Courier New" w:hAnsi="Courier New" w:cs="Courier New"/>
+        </w:rPr>
+        <w:t xml:space="preserve">        }</w:t>
+      </w:r>
+    </w:p>
+    <w:p>
+      <w:pPr>
+        <w:pStyle w:val="PlainText"/>
+        <w:rPr>
+          <w:rFonts w:ascii="Courier New" w:hAnsi="Courier New" w:cs="Courier New"/>
+        </w:rPr>
+      </w:pPr>
+    </w:p>
+    <w:p>
+      <w:pPr>
+        <w:pStyle w:val="PlainText"/>
+        <w:rPr>
+          <w:rFonts w:ascii="Courier New" w:hAnsi="Courier New" w:cs="Courier New"/>
+        </w:rPr>
+      </w:pPr>
+      <w:r>
+        <w:rPr>
+          <w:rFonts w:ascii="Courier New" w:hAnsi="Courier New" w:cs="Courier New"/>
+        </w:rPr>
+        <w:t xml:space="preserve">        delete temp;</w:t>
+      </w:r>
+    </w:p>
+    <w:p>
+      <w:pPr>
+        <w:pStyle w:val="PlainText"/>
+        <w:rPr>
+          <w:rFonts w:ascii="Courier New" w:hAnsi="Courier New" w:cs="Courier New"/>
+        </w:rPr>
+      </w:pPr>
+      <w:r>
+        <w:rPr>
+          <w:rFonts w:ascii="Courier New" w:hAnsi="Courier New" w:cs="Courier New"/>
+        </w:rPr>
+        <w:t xml:space="preserve">    }</w:t>
+      </w:r>
+    </w:p>
+    <w:p>
+      <w:pPr>
+        <w:pStyle w:val="PlainText"/>
+        <w:rPr>
+          <w:rFonts w:ascii="Courier New" w:hAnsi="Courier New" w:cs="Courier New"/>
+        </w:rPr>
+      </w:pPr>
+    </w:p>
+    <w:p>
+      <w:pPr>
+        <w:pStyle w:val="PlainText"/>
+        <w:rPr>
+          <w:rFonts w:ascii="Courier New" w:hAnsi="Courier New" w:cs="Courier New"/>
+        </w:rPr>
+      </w:pPr>
+      <w:r>
+        <w:rPr>
+          <w:rFonts w:ascii="Courier New" w:hAnsi="Courier New" w:cs="Courier New"/>
+        </w:rPr>
+        <w:t xml:space="preserve">    void search(int </w:t>
+      </w:r>
+      <w:proofErr w:type="spellStart"/>
+      <w:r>
+        <w:rPr>
+          <w:rFonts w:ascii="Courier New" w:hAnsi="Courier New" w:cs="Courier New"/>
+        </w:rPr>
+        <w:t>val</w:t>
+      </w:r>
+      <w:proofErr w:type="spellEnd"/>
+      <w:r>
+        <w:rPr>
+          <w:rFonts w:ascii="Courier New" w:hAnsi="Courier New" w:cs="Courier New"/>
+        </w:rPr>
+        <w:t>){</w:t>
+      </w:r>
+    </w:p>
+    <w:p>
+      <w:pPr>
+        <w:pStyle w:val="PlainText"/>
+        <w:rPr>
+          <w:rFonts w:ascii="Courier New" w:hAnsi="Courier New" w:cs="Courier New"/>
+        </w:rPr>
+      </w:pPr>
+      <w:r>
+        <w:rPr>
+          <w:rFonts w:ascii="Courier New" w:hAnsi="Courier New" w:cs="Courier New"/>
+        </w:rPr>
+        <w:t xml:space="preserve">        if(head == NULL){</w:t>
+      </w:r>
+    </w:p>
+    <w:p>
+      <w:pPr>
+        <w:pStyle w:val="PlainText"/>
+        <w:rPr>
+          <w:rFonts w:ascii="Courier New" w:hAnsi="Courier New" w:cs="Courier New"/>
+        </w:rPr>
+      </w:pPr>
+      <w:r>
+        <w:rPr>
+          <w:rFonts w:ascii="Courier New" w:hAnsi="Courier New" w:cs="Courier New"/>
+        </w:rPr>
+        <w:t xml:space="preserve">            </w:t>
+      </w:r>
+      <w:proofErr w:type="spellStart"/>
+      <w:r>
+        <w:rPr>
+          <w:rFonts w:ascii="Courier New" w:hAnsi="Courier New" w:cs="Courier New"/>
+        </w:rPr>
+        <w:t>cout</w:t>
+      </w:r>
+      <w:proofErr w:type="spellEnd"/>
+      <w:r>
+        <w:rPr>
+          <w:rFonts w:ascii="Courier New" w:hAnsi="Courier New" w:cs="Courier New"/>
+        </w:rPr>
+        <w:t xml:space="preserve"> &lt;&lt; "List is empty" &lt;&lt; </w:t>
+      </w:r>
+      <w:proofErr w:type="spellStart"/>
+      <w:r>
+        <w:rPr>
+          <w:rFonts w:ascii="Courier New" w:hAnsi="Courier New" w:cs="Courier New"/>
+        </w:rPr>
+        <w:t>endl</w:t>
+      </w:r>
+      <w:proofErr w:type="spellEnd"/>
+      <w:r>
+        <w:rPr>
+          <w:rFonts w:ascii="Courier New" w:hAnsi="Courier New" w:cs="Courier New"/>
+        </w:rPr>
+        <w:t>;</w:t>
+      </w:r>
+    </w:p>
+    <w:p>
+      <w:pPr>
+        <w:pStyle w:val="PlainText"/>
+        <w:rPr>
+          <w:rFonts w:ascii="Courier New" w:hAnsi="Courier New" w:cs="Courier New"/>
+        </w:rPr>
+      </w:pPr>
+      <w:r>
+        <w:rPr>
+          <w:rFonts w:ascii="Courier New" w:hAnsi="Courier New" w:cs="Courier New"/>
+        </w:rPr>
+        <w:t xml:space="preserve">            return;</w:t>
+      </w:r>
+    </w:p>
+    <w:p>
+      <w:pPr>
+        <w:pStyle w:val="PlainText"/>
+        <w:rPr>
+          <w:rFonts w:ascii="Courier New" w:hAnsi="Courier New" w:cs="Courier New"/>
+        </w:rPr>
+      </w:pPr>
+      <w:r>
+        <w:rPr>
+          <w:rFonts w:ascii="Courier New" w:hAnsi="Courier New" w:cs="Courier New"/>
+        </w:rPr>
+        <w:t xml:space="preserve">        }</w:t>
+      </w:r>
+    </w:p>
+    <w:p>
+      <w:pPr>
+        <w:pStyle w:val="PlainText"/>
+        <w:rPr>
+          <w:rFonts w:ascii="Courier New" w:hAnsi="Courier New" w:cs="Courier New"/>
+        </w:rPr>
+      </w:pPr>
+    </w:p>
+    <w:p>
+      <w:pPr>
+        <w:pStyle w:val="PlainText"/>
+        <w:rPr>
+          <w:rFonts w:ascii="Courier New" w:hAnsi="Courier New" w:cs="Courier New"/>
+        </w:rPr>
+      </w:pPr>
+      <w:r>
+        <w:rPr>
+          <w:rFonts w:ascii="Courier New" w:hAnsi="Courier New" w:cs="Courier New"/>
+        </w:rPr>
+        <w:t xml:space="preserve">        Node* temp = head;</w:t>
+      </w:r>
+    </w:p>
+    <w:p>
+      <w:pPr>
+        <w:pStyle w:val="PlainText"/>
+        <w:rPr>
+          <w:rFonts w:ascii="Courier New" w:hAnsi="Courier New" w:cs="Courier New"/>
+        </w:rPr>
+      </w:pPr>
+      <w:r>
+        <w:rPr>
+          <w:rFonts w:ascii="Courier New" w:hAnsi="Courier New" w:cs="Courier New"/>
+        </w:rPr>
+        <w:t xml:space="preserve">        int pos = 1;</w:t>
+      </w:r>
+    </w:p>
+    <w:p>
+      <w:pPr>
+        <w:pStyle w:val="PlainText"/>
+        <w:rPr>
+          <w:rFonts w:ascii="Courier New" w:hAnsi="Courier New" w:cs="Courier New"/>
+        </w:rPr>
+      </w:pPr>
+    </w:p>
+    <w:p>
+      <w:pPr>
+        <w:pStyle w:val="PlainText"/>
+        <w:rPr>
+          <w:rFonts w:ascii="Courier New" w:hAnsi="Courier New" w:cs="Courier New"/>
+        </w:rPr>
+      </w:pPr>
+      <w:r>
+        <w:rPr>
+          <w:rFonts w:ascii="Courier New" w:hAnsi="Courier New" w:cs="Courier New"/>
+        </w:rPr>
+        <w:t xml:space="preserve">        do{</w:t>
+      </w:r>
+    </w:p>
+    <w:p>
+      <w:pPr>
+        <w:pStyle w:val="PlainText"/>
+        <w:rPr>
+          <w:rFonts w:ascii="Courier New" w:hAnsi="Courier New" w:cs="Courier New"/>
+        </w:rPr>
+      </w:pPr>
+      <w:r>
+        <w:rPr>
+          <w:rFonts w:ascii="Courier New" w:hAnsi="Courier New" w:cs="Courier New"/>
+        </w:rPr>
+        <w:t xml:space="preserve">            if(temp-&gt;data == </w:t>
+      </w:r>
+      <w:proofErr w:type="spellStart"/>
+      <w:r>
+        <w:rPr>
+          <w:rFonts w:ascii="Courier New" w:hAnsi="Courier New" w:cs="Courier New"/>
+        </w:rPr>
+        <w:t>val</w:t>
+      </w:r>
+      <w:proofErr w:type="spellEnd"/>
+      <w:r>
+        <w:rPr>
+          <w:rFonts w:ascii="Courier New" w:hAnsi="Courier New" w:cs="Courier New"/>
+        </w:rPr>
+        <w:t>){</w:t>
+      </w:r>
+    </w:p>
+    <w:p>
+      <w:pPr>
+        <w:pStyle w:val="PlainText"/>
+        <w:rPr>
+          <w:rFonts w:ascii="Courier New" w:hAnsi="Courier New" w:cs="Courier New"/>
+        </w:rPr>
+      </w:pPr>
+      <w:r>
+        <w:rPr>
+          <w:rFonts w:ascii="Courier New" w:hAnsi="Courier New" w:cs="Courier New"/>
+        </w:rPr>
+        <w:t xml:space="preserve">                </w:t>
+      </w:r>
+      <w:proofErr w:type="spellStart"/>
+      <w:r>
+        <w:rPr>
+          <w:rFonts w:ascii="Courier New" w:hAnsi="Courier New" w:cs="Courier New"/>
+        </w:rPr>
+        <w:t>cout</w:t>
+      </w:r>
+      <w:proofErr w:type="spellEnd"/>
+      <w:r>
+        <w:rPr>
+          <w:rFonts w:ascii="Courier New" w:hAnsi="Courier New" w:cs="Courier New"/>
+        </w:rPr>
+        <w:t xml:space="preserve"> &lt;&lt; "Value found at position " &lt;&lt; pos &lt;&lt; </w:t>
+      </w:r>
+      <w:proofErr w:type="spellStart"/>
+      <w:r>
+        <w:rPr>
+          <w:rFonts w:ascii="Courier New" w:hAnsi="Courier New" w:cs="Courier New"/>
+        </w:rPr>
+        <w:t>endl</w:t>
+      </w:r>
+      <w:proofErr w:type="spellEnd"/>
+      <w:r>
+        <w:rPr>
+          <w:rFonts w:ascii="Courier New" w:hAnsi="Courier New" w:cs="Courier New"/>
+        </w:rPr>
+        <w:t>;</w:t>
+      </w:r>
+    </w:p>
+    <w:p>
+      <w:pPr>
+        <w:pStyle w:val="PlainText"/>
+        <w:rPr>
+          <w:rFonts w:ascii="Courier New" w:hAnsi="Courier New" w:cs="Courier New"/>
+        </w:rPr>
+      </w:pPr>
+      <w:r>
+        <w:rPr>
+          <w:rFonts w:ascii="Courier New" w:hAnsi="Courier New" w:cs="Courier New"/>
+        </w:rPr>
+        <w:t xml:space="preserve">                return;</w:t>
+      </w:r>
+    </w:p>
+    <w:p>
+      <w:pPr>
+        <w:pStyle w:val="PlainText"/>
+        <w:rPr>
+          <w:rFonts w:ascii="Courier New" w:hAnsi="Courier New" w:cs="Courier New"/>
+        </w:rPr>
+      </w:pPr>
+      <w:r>
+        <w:rPr>
+          <w:rFonts w:ascii="Courier New" w:hAnsi="Courier New" w:cs="Courier New"/>
+        </w:rPr>
+        <w:t xml:space="preserve">            }</w:t>
+      </w:r>
+    </w:p>
+    <w:p>
+      <w:pPr>
+        <w:pStyle w:val="PlainText"/>
+        <w:rPr>
+          <w:rFonts w:ascii="Courier New" w:hAnsi="Courier New" w:cs="Courier New"/>
+        </w:rPr>
+      </w:pPr>
+    </w:p>
+    <w:p>
+      <w:pPr>
+        <w:pStyle w:val="PlainText"/>
+        <w:rPr>
+          <w:rFonts w:ascii="Courier New" w:hAnsi="Courier New" w:cs="Courier New"/>
+        </w:rPr>
+      </w:pPr>
+      <w:r>
+        <w:rPr>
+          <w:rFonts w:ascii="Courier New" w:hAnsi="Courier New" w:cs="Courier New"/>
+        </w:rPr>
+        <w:t xml:space="preserve">            temp = temp-&gt;next;</w:t>
+      </w:r>
+    </w:p>
+    <w:p>
+      <w:pPr>
+        <w:pStyle w:val="PlainText"/>
+        <w:rPr>
+          <w:rFonts w:ascii="Courier New" w:hAnsi="Courier New" w:cs="Courier New"/>
+        </w:rPr>
+      </w:pPr>
+      <w:r>
+        <w:rPr>
+          <w:rFonts w:ascii="Courier New" w:hAnsi="Courier New" w:cs="Courier New"/>
+        </w:rPr>
+        <w:t xml:space="preserve">            pos++;</w:t>
+      </w:r>
+    </w:p>
+    <w:p>
+      <w:pPr>
+        <w:pStyle w:val="PlainText"/>
+        <w:rPr>
+          <w:rFonts w:ascii="Courier New" w:hAnsi="Courier New" w:cs="Courier New"/>
+        </w:rPr>
+      </w:pPr>
+      <w:r>
+        <w:rPr>
+          <w:rFonts w:ascii="Courier New" w:hAnsi="Courier New" w:cs="Courier New"/>
+        </w:rPr>
+        <w:t xml:space="preserve">        }while(temp != head);</w:t>
+      </w:r>
+    </w:p>
+    <w:p>
+      <w:pPr>
+        <w:pStyle w:val="PlainText"/>
+        <w:rPr>
+          <w:rFonts w:ascii="Courier New" w:hAnsi="Courier New" w:cs="Courier New"/>
+        </w:rPr>
+      </w:pPr>
+    </w:p>
+    <w:p>
+      <w:pPr>
+        <w:pStyle w:val="PlainText"/>
+        <w:rPr>
+          <w:rFonts w:ascii="Courier New" w:hAnsi="Courier New" w:cs="Courier New"/>
+        </w:rPr>
+      </w:pPr>
+      <w:r>
+        <w:rPr>
+          <w:rFonts w:ascii="Courier New" w:hAnsi="Courier New" w:cs="Courier New"/>
+        </w:rPr>
+        <w:t xml:space="preserve">        </w:t>
+      </w:r>
+      <w:proofErr w:type="spellStart"/>
+      <w:r>
+        <w:rPr>
+          <w:rFonts w:ascii="Courier New" w:hAnsi="Courier New" w:cs="Courier New"/>
+        </w:rPr>
+        <w:t>cout</w:t>
+      </w:r>
+      <w:proofErr w:type="spellEnd"/>
+      <w:r>
+        <w:rPr>
+          <w:rFonts w:ascii="Courier New" w:hAnsi="Courier New" w:cs="Courier New"/>
+        </w:rPr>
+        <w:t xml:space="preserve"> &lt;&lt; "Value not found" &lt;&lt; </w:t>
+      </w:r>
+      <w:proofErr w:type="spellStart"/>
+      <w:r>
+        <w:rPr>
+          <w:rFonts w:ascii="Courier New" w:hAnsi="Courier New" w:cs="Courier New"/>
+        </w:rPr>
+        <w:t>endl</w:t>
+      </w:r>
+      <w:proofErr w:type="spellEnd"/>
+      <w:r>
+        <w:rPr>
+          <w:rFonts w:ascii="Courier New" w:hAnsi="Courier New" w:cs="Courier New"/>
+        </w:rPr>
+        <w:t>;</w:t>
+      </w:r>
+    </w:p>
+    <w:p>
+      <w:pPr>
+        <w:pStyle w:val="PlainText"/>
+        <w:rPr>
+          <w:rFonts w:ascii="Courier New" w:hAnsi="Courier New" w:cs="Courier New"/>
+        </w:rPr>
+      </w:pPr>
+      <w:r>
+        <w:rPr>
+          <w:rFonts w:ascii="Courier New" w:hAnsi="Courier New" w:cs="Courier New"/>
+        </w:rPr>
+        <w:t xml:space="preserve">    }</w:t>
+      </w:r>
+    </w:p>
+    <w:p>
+      <w:pPr>
+        <w:pStyle w:val="PlainText"/>
+        <w:rPr>
+          <w:rFonts w:ascii="Courier New" w:hAnsi="Courier New" w:cs="Courier New"/>
+        </w:rPr>
+      </w:pPr>
+    </w:p>
+    <w:p>
+      <w:pPr>
+        <w:pStyle w:val="PlainText"/>
+        <w:rPr>
+          <w:rFonts w:ascii="Courier New" w:hAnsi="Courier New" w:cs="Courier New"/>
+        </w:rPr>
+      </w:pPr>
+      <w:r>
+        <w:rPr>
+          <w:rFonts w:ascii="Courier New" w:hAnsi="Courier New" w:cs="Courier New"/>
+        </w:rPr>
+        <w:t xml:space="preserve">    void display(){</w:t>
+      </w:r>
+    </w:p>
+    <w:p>
+      <w:pPr>
+        <w:pStyle w:val="PlainText"/>
+        <w:rPr>
+          <w:rFonts w:ascii="Courier New" w:hAnsi="Courier New" w:cs="Courier New"/>
+        </w:rPr>
+      </w:pPr>
+      <w:r>
+        <w:rPr>
+          <w:rFonts w:ascii="Courier New" w:hAnsi="Courier New" w:cs="Courier New"/>
+        </w:rPr>
+        <w:lastRenderedPageBreak/>
+        <w:t xml:space="preserve">        if(head == NULL){</w:t>
+      </w:r>
+    </w:p>
+    <w:p>
+      <w:pPr>
+        <w:pStyle w:val="PlainText"/>
+        <w:rPr>
+          <w:rFonts w:ascii="Courier New" w:hAnsi="Courier New" w:cs="Courier New"/>
+        </w:rPr>
+      </w:pPr>
+      <w:r>
+        <w:rPr>
+          <w:rFonts w:ascii="Courier New" w:hAnsi="Courier New" w:cs="Courier New"/>
+        </w:rPr>
+        <w:t xml:space="preserve">            </w:t>
+      </w:r>
+      <w:proofErr w:type="spellStart"/>
+      <w:r>
+        <w:rPr>
+          <w:rFonts w:ascii="Courier New" w:hAnsi="Courier New" w:cs="Courier New"/>
+        </w:rPr>
+        <w:t>cout</w:t>
+      </w:r>
+      <w:proofErr w:type="spellEnd"/>
+      <w:r>
+        <w:rPr>
+          <w:rFonts w:ascii="Courier New" w:hAnsi="Courier New" w:cs="Courier New"/>
+        </w:rPr>
+        <w:t xml:space="preserve"> &lt;&lt; "List is empty" &lt;&lt; </w:t>
+      </w:r>
+      <w:proofErr w:type="spellStart"/>
+      <w:r>
+        <w:rPr>
+          <w:rFonts w:ascii="Courier New" w:hAnsi="Courier New" w:cs="Courier New"/>
+        </w:rPr>
+        <w:t>endl</w:t>
+      </w:r>
+      <w:proofErr w:type="spellEnd"/>
+      <w:r>
+        <w:rPr>
+          <w:rFonts w:ascii="Courier New" w:hAnsi="Courier New" w:cs="Courier New"/>
+        </w:rPr>
+        <w:t>;</w:t>
+      </w:r>
+    </w:p>
+    <w:p>
+      <w:pPr>
+        <w:pStyle w:val="PlainText"/>
+        <w:rPr>
+          <w:rFonts w:ascii="Courier New" w:hAnsi="Courier New" w:cs="Courier New"/>
+        </w:rPr>
+      </w:pPr>
+      <w:r>
+        <w:rPr>
+          <w:rFonts w:ascii="Courier New" w:hAnsi="Courier New" w:cs="Courier New"/>
+        </w:rPr>
+        <w:t xml:space="preserve">            return;</w:t>
+      </w:r>
+    </w:p>
+    <w:p>
+      <w:pPr>
+        <w:pStyle w:val="PlainText"/>
+        <w:rPr>
+          <w:rFonts w:ascii="Courier New" w:hAnsi="Courier New" w:cs="Courier New"/>
+        </w:rPr>
+      </w:pPr>
+      <w:r>
+        <w:rPr>
+          <w:rFonts w:ascii="Courier New" w:hAnsi="Courier New" w:cs="Courier New"/>
+        </w:rPr>
+        <w:t xml:space="preserve">        }</w:t>
+      </w:r>
+    </w:p>
+    <w:p>
+      <w:pPr>
+        <w:pStyle w:val="PlainText"/>
+        <w:rPr>
+          <w:rFonts w:ascii="Courier New" w:hAnsi="Courier New" w:cs="Courier New"/>
+        </w:rPr>
+      </w:pPr>
+    </w:p>
+    <w:p>
+      <w:pPr>
+        <w:pStyle w:val="PlainText"/>
+        <w:rPr>
+          <w:rFonts w:ascii="Courier New" w:hAnsi="Courier New" w:cs="Courier New"/>
+        </w:rPr>
+      </w:pPr>
+      <w:r>
+        <w:rPr>
+          <w:rFonts w:ascii="Courier New" w:hAnsi="Courier New" w:cs="Courier New"/>
+        </w:rPr>
+        <w:t xml:space="preserve">        Node* temp = head;</w:t>
+      </w:r>
+    </w:p>
+    <w:p>
+      <w:pPr>
+        <w:pStyle w:val="PlainText"/>
+        <w:rPr>
+          <w:rFonts w:ascii="Courier New" w:hAnsi="Courier New" w:cs="Courier New"/>
+        </w:rPr>
+      </w:pPr>
+    </w:p>
+    <w:p>
+      <w:pPr>
+        <w:pStyle w:val="PlainText"/>
+        <w:rPr>
+          <w:rFonts w:ascii="Courier New" w:hAnsi="Courier New" w:cs="Courier New"/>
+        </w:rPr>
+      </w:pPr>
+      <w:r>
+        <w:rPr>
+          <w:rFonts w:ascii="Courier New" w:hAnsi="Courier New" w:cs="Courier New"/>
+        </w:rPr>
+        <w:t xml:space="preserve">        do{</w:t>
+      </w:r>
+    </w:p>
+    <w:p>
+      <w:pPr>
+        <w:pStyle w:val="PlainText"/>
+        <w:rPr>
+          <w:rFonts w:ascii="Courier New" w:hAnsi="Courier New" w:cs="Courier New"/>
+        </w:rPr>
+      </w:pPr>
+      <w:r>
+        <w:rPr>
+          <w:rFonts w:ascii="Courier New" w:hAnsi="Courier New" w:cs="Courier New"/>
+        </w:rPr>
+        <w:t xml:space="preserve">            </w:t>
+      </w:r>
+      <w:proofErr w:type="spellStart"/>
+      <w:r>
+        <w:rPr>
+          <w:rFonts w:ascii="Courier New" w:hAnsi="Courier New" w:cs="Courier New"/>
+        </w:rPr>
+        <w:t>cout</w:t>
+      </w:r>
+      <w:proofErr w:type="spellEnd"/>
+      <w:r>
+        <w:rPr>
+          <w:rFonts w:ascii="Courier New" w:hAnsi="Courier New" w:cs="Courier New"/>
+        </w:rPr>
+        <w:t xml:space="preserve"> &lt;&lt; temp-&gt;data &lt;&lt; " ";</w:t>
+      </w:r>
+    </w:p>
+    <w:p>
+      <w:pPr>
+        <w:pStyle w:val="PlainText"/>
+        <w:rPr>
+          <w:rFonts w:ascii="Courier New" w:hAnsi="Courier New" w:cs="Courier New"/>
+        </w:rPr>
+      </w:pPr>
+      <w:r>
+        <w:rPr>
+          <w:rFonts w:ascii="Courier New" w:hAnsi="Courier New" w:cs="Courier New"/>
+        </w:rPr>
+        <w:t xml:space="preserve">            temp = temp-&gt;next;</w:t>
+      </w:r>
+    </w:p>
+    <w:p>
+      <w:pPr>
+        <w:pStyle w:val="PlainText"/>
+        <w:rPr>
+          <w:rFonts w:ascii="Courier New" w:hAnsi="Courier New" w:cs="Courier New"/>
+        </w:rPr>
+      </w:pPr>
+      <w:r>
+        <w:rPr>
+          <w:rFonts w:ascii="Courier New" w:hAnsi="Courier New" w:cs="Courier New"/>
+        </w:rPr>
+        <w:t xml:space="preserve">        }while(temp != head);</w:t>
+      </w:r>
+    </w:p>
+    <w:p>
+      <w:pPr>
+        <w:pStyle w:val="PlainText"/>
+        <w:rPr>
+          <w:rFonts w:ascii="Courier New" w:hAnsi="Courier New" w:cs="Courier New"/>
+        </w:rPr>
+      </w:pPr>
+    </w:p>
+    <w:p>
+      <w:pPr>
+        <w:pStyle w:val="PlainText"/>
+        <w:rPr>
+          <w:rFonts w:ascii="Courier New" w:hAnsi="Courier New" w:cs="Courier New"/>
+        </w:rPr>
+      </w:pPr>
+      <w:r>
+        <w:rPr>
+          <w:rFonts w:ascii="Courier New" w:hAnsi="Courier New" w:cs="Courier New"/>
+        </w:rPr>
+        <w:t xml:space="preserve">        </w:t>
+      </w:r>
+      <w:proofErr w:type="spellStart"/>
+      <w:r>
+        <w:rPr>
+          <w:rFonts w:ascii="Courier New" w:hAnsi="Courier New" w:cs="Courier New"/>
+        </w:rPr>
+        <w:t>cout</w:t>
+      </w:r>
+      <w:proofErr w:type="spellEnd"/>
+      <w:r>
+        <w:rPr>
+          <w:rFonts w:ascii="Courier New" w:hAnsi="Courier New" w:cs="Courier New"/>
+        </w:rPr>
+        <w:t xml:space="preserve"> &lt;&lt; </w:t>
+      </w:r>
+      <w:proofErr w:type="spellStart"/>
+      <w:r>
+        <w:rPr>
+          <w:rFonts w:ascii="Courier New" w:hAnsi="Courier New" w:cs="Courier New"/>
+        </w:rPr>
+        <w:t>endl</w:t>
+      </w:r>
+      <w:proofErr w:type="spellEnd"/>
+      <w:r>
+        <w:rPr>
+          <w:rFonts w:ascii="Courier New" w:hAnsi="Courier New" w:cs="Courier New"/>
+        </w:rPr>
+        <w:t>;</w:t>
+      </w:r>
+    </w:p>
+    <w:p>
+      <w:pPr>
+        <w:pStyle w:val="PlainText"/>
+        <w:rPr>
+          <w:rFonts w:ascii="Courier New" w:hAnsi="Courier New" w:cs="Courier New"/>
+        </w:rPr>
+      </w:pPr>
+      <w:r>
+        <w:rPr>
+          <w:rFonts w:ascii="Courier New" w:hAnsi="Courier New" w:cs="Courier New"/>
+        </w:rPr>
+        <w:t xml:space="preserve">    }</w:t>
+      </w:r>
+    </w:p>
+    <w:p>
+      <w:pPr>
+        <w:pStyle w:val="PlainText"/>
+        <w:rPr>
+          <w:rFonts w:ascii="Courier New" w:hAnsi="Courier New" w:cs="Courier New"/>
+        </w:rPr>
+      </w:pPr>
+      <w:r>
+        <w:rPr>
+          <w:rFonts w:ascii="Courier New" w:hAnsi="Courier New" w:cs="Courier New"/>
+        </w:rPr>
+        <w:t>};</w:t>
+      </w:r>
+    </w:p>
+    <w:p>
+      <w:pPr>
+        <w:pStyle w:val="PlainText"/>
+        <w:rPr>
+          <w:rFonts w:ascii="Courier New" w:hAnsi="Courier New" w:cs="Courier New"/>
+        </w:rPr>
+      </w:pPr>
+    </w:p>
+    <w:p>
+      <w:pPr>
+        <w:pStyle w:val="PlainText"/>
+        <w:rPr>
+          <w:rFonts w:ascii="Courier New" w:hAnsi="Courier New" w:cs="Courier New"/>
+        </w:rPr>
+      </w:pPr>
+      <w:r>
+        <w:rPr>
+          <w:rFonts w:ascii="Courier New" w:hAnsi="Courier New" w:cs="Courier New"/>
+        </w:rPr>
+        <w:t>int main(){</w:t>
+      </w:r>
+    </w:p>
+    <w:p>
+      <w:pPr>
+        <w:pStyle w:val="PlainText"/>
+        <w:rPr>
+          <w:rFonts w:ascii="Courier New" w:hAnsi="Courier New" w:cs="Courier New"/>
+        </w:rPr>
+      </w:pPr>
+      <w:r>
+        <w:rPr>
+          <w:rFonts w:ascii="Courier New" w:hAnsi="Courier New" w:cs="Courier New"/>
+        </w:rPr>
+        <w:t xml:space="preserve">    CL c;</w:t>
+      </w:r>
+    </w:p>
+    <w:p>
+      <w:pPr>
+        <w:pStyle w:val="PlainText"/>
+        <w:rPr>
+          <w:rFonts w:ascii="Courier New" w:hAnsi="Courier New" w:cs="Courier New"/>
+        </w:rPr>
+      </w:pPr>
+    </w:p>
+    <w:p>
+      <w:pPr>
+        <w:pStyle w:val="PlainText"/>
+        <w:rPr>
+          <w:rFonts w:ascii="Courier New" w:hAnsi="Courier New" w:cs="Courier New"/>
+        </w:rPr>
+      </w:pPr>
+      <w:r>
+        <w:rPr>
+          <w:rFonts w:ascii="Courier New" w:hAnsi="Courier New" w:cs="Courier New"/>
+        </w:rPr>
+        <w:t xml:space="preserve">    int choice, </w:t>
+      </w:r>
+      <w:proofErr w:type="spellStart"/>
+      <w:r>
+        <w:rPr>
+          <w:rFonts w:ascii="Courier New" w:hAnsi="Courier New" w:cs="Courier New"/>
+        </w:rPr>
+        <w:t>val</w:t>
+      </w:r>
+      <w:proofErr w:type="spellEnd"/>
+      <w:r>
+        <w:rPr>
+          <w:rFonts w:ascii="Courier New" w:hAnsi="Courier New" w:cs="Courier New"/>
+        </w:rPr>
+        <w:t>, pos;</w:t>
+      </w:r>
+    </w:p>
+    <w:p>
+      <w:pPr>
+        <w:pStyle w:val="PlainText"/>
+        <w:rPr>
+          <w:rFonts w:ascii="Courier New" w:hAnsi="Courier New" w:cs="Courier New"/>
+        </w:rPr>
+      </w:pPr>
+    </w:p>
+    <w:p>
+      <w:pPr>
+        <w:pStyle w:val="PlainText"/>
+        <w:rPr>
+          <w:rFonts w:ascii="Courier New" w:hAnsi="Courier New" w:cs="Courier New"/>
+        </w:rPr>
+      </w:pPr>
+      <w:r>
+        <w:rPr>
+          <w:rFonts w:ascii="Courier New" w:hAnsi="Courier New" w:cs="Courier New"/>
+        </w:rPr>
+        <w:t xml:space="preserve">    do{</w:t>
+      </w:r>
+    </w:p>
+    <w:p>
+      <w:pPr>
+        <w:pStyle w:val="PlainText"/>
+        <w:rPr>
+          <w:rFonts w:ascii="Courier New" w:hAnsi="Courier New" w:cs="Courier New"/>
+        </w:rPr>
+      </w:pPr>
+      <w:r>
+        <w:rPr>
+          <w:rFonts w:ascii="Courier New" w:hAnsi="Courier New" w:cs="Courier New"/>
+        </w:rPr>
+        <w:t xml:space="preserve">        </w:t>
+      </w:r>
+      <w:proofErr w:type="spellStart"/>
+      <w:r>
+        <w:rPr>
+          <w:rFonts w:ascii="Courier New" w:hAnsi="Courier New" w:cs="Courier New"/>
+        </w:rPr>
+        <w:t>cout</w:t>
+      </w:r>
+      <w:proofErr w:type="spellEnd"/>
+      <w:r>
+        <w:rPr>
+          <w:rFonts w:ascii="Courier New" w:hAnsi="Courier New" w:cs="Courier New"/>
+        </w:rPr>
+        <w:t xml:space="preserve"> &lt;&lt; "\n1. Insert at End";</w:t>
+      </w:r>
+    </w:p>
+    <w:p>
+      <w:pPr>
+        <w:pStyle w:val="PlainText"/>
+        <w:rPr>
+          <w:rFonts w:ascii="Courier New" w:hAnsi="Courier New" w:cs="Courier New"/>
+        </w:rPr>
+      </w:pPr>
+      <w:r>
+        <w:rPr>
+          <w:rFonts w:ascii="Courier New" w:hAnsi="Courier New" w:cs="Courier New"/>
+        </w:rPr>
+        <w:t xml:space="preserve">        </w:t>
+      </w:r>
+      <w:proofErr w:type="spellStart"/>
+      <w:r>
+        <w:rPr>
+          <w:rFonts w:ascii="Courier New" w:hAnsi="Courier New" w:cs="Courier New"/>
+        </w:rPr>
+        <w:t>cout</w:t>
+      </w:r>
+      <w:proofErr w:type="spellEnd"/>
+      <w:r>
+        <w:rPr>
+          <w:rFonts w:ascii="Courier New" w:hAnsi="Courier New" w:cs="Courier New"/>
+        </w:rPr>
+        <w:t xml:space="preserve"> &lt;&lt; "\n2. Insert at Beginning";</w:t>
+      </w:r>
+    </w:p>
+    <w:p>
+      <w:pPr>
+        <w:pStyle w:val="PlainText"/>
+        <w:rPr>
+          <w:rFonts w:ascii="Courier New" w:hAnsi="Courier New" w:cs="Courier New"/>
+        </w:rPr>
+      </w:pPr>
+      <w:r>
+        <w:rPr>
+          <w:rFonts w:ascii="Courier New" w:hAnsi="Courier New" w:cs="Courier New"/>
+        </w:rPr>
+        <w:t xml:space="preserve">        </w:t>
+      </w:r>
+      <w:proofErr w:type="spellStart"/>
+      <w:r>
+        <w:rPr>
+          <w:rFonts w:ascii="Courier New" w:hAnsi="Courier New" w:cs="Courier New"/>
+        </w:rPr>
+        <w:t>cout</w:t>
+      </w:r>
+      <w:proofErr w:type="spellEnd"/>
+      <w:r>
+        <w:rPr>
+          <w:rFonts w:ascii="Courier New" w:hAnsi="Courier New" w:cs="Courier New"/>
+        </w:rPr>
+        <w:t xml:space="preserve"> &lt;&lt; "\n3. Insert at Position";</w:t>
+      </w:r>
+    </w:p>
+    <w:p>
+      <w:pPr>
+        <w:pStyle w:val="PlainText"/>
+        <w:rPr>
+          <w:rFonts w:ascii="Courier New" w:hAnsi="Courier New" w:cs="Courier New"/>
+        </w:rPr>
+      </w:pPr>
+      <w:r>
+        <w:rPr>
+          <w:rFonts w:ascii="Courier New" w:hAnsi="Courier New" w:cs="Courier New"/>
+        </w:rPr>
+        <w:t xml:space="preserve">        </w:t>
+      </w:r>
+      <w:proofErr w:type="spellStart"/>
+      <w:r>
+        <w:rPr>
+          <w:rFonts w:ascii="Courier New" w:hAnsi="Courier New" w:cs="Courier New"/>
+        </w:rPr>
+        <w:t>cout</w:t>
+      </w:r>
+      <w:proofErr w:type="spellEnd"/>
+      <w:r>
+        <w:rPr>
+          <w:rFonts w:ascii="Courier New" w:hAnsi="Courier New" w:cs="Courier New"/>
+        </w:rPr>
+        <w:t xml:space="preserve"> &lt;&lt; "\n4. Delete Node";</w:t>
+      </w:r>
+    </w:p>
+    <w:p>
+      <w:pPr>
+        <w:pStyle w:val="PlainText"/>
+        <w:rPr>
+          <w:rFonts w:ascii="Courier New" w:hAnsi="Courier New" w:cs="Courier New"/>
+        </w:rPr>
+      </w:pPr>
+      <w:r>
+        <w:rPr>
+          <w:rFonts w:ascii="Courier New" w:hAnsi="Courier New" w:cs="Courier New"/>
+        </w:rPr>
+        <w:t xml:space="preserve">        </w:t>
+      </w:r>
+      <w:proofErr w:type="spellStart"/>
+      <w:r>
+        <w:rPr>
+          <w:rFonts w:ascii="Courier New" w:hAnsi="Courier New" w:cs="Courier New"/>
+        </w:rPr>
+        <w:t>cout</w:t>
+      </w:r>
+      <w:proofErr w:type="spellEnd"/>
+      <w:r>
+        <w:rPr>
+          <w:rFonts w:ascii="Courier New" w:hAnsi="Courier New" w:cs="Courier New"/>
+        </w:rPr>
+        <w:t xml:space="preserve"> &lt;&lt; "\n5. Search";</w:t>
+      </w:r>
+    </w:p>
+    <w:p>
+      <w:pPr>
+        <w:pStyle w:val="PlainText"/>
+        <w:rPr>
+          <w:rFonts w:ascii="Courier New" w:hAnsi="Courier New" w:cs="Courier New"/>
+        </w:rPr>
+      </w:pPr>
+      <w:r>
+        <w:rPr>
+          <w:rFonts w:ascii="Courier New" w:hAnsi="Courier New" w:cs="Courier New"/>
+        </w:rPr>
+        <w:t xml:space="preserve">        </w:t>
+      </w:r>
+      <w:proofErr w:type="spellStart"/>
+      <w:r>
+        <w:rPr>
+          <w:rFonts w:ascii="Courier New" w:hAnsi="Courier New" w:cs="Courier New"/>
+        </w:rPr>
+        <w:t>cout</w:t>
+      </w:r>
+      <w:proofErr w:type="spellEnd"/>
+      <w:r>
+        <w:rPr>
+          <w:rFonts w:ascii="Courier New" w:hAnsi="Courier New" w:cs="Courier New"/>
+        </w:rPr>
+        <w:t xml:space="preserve"> &lt;&lt; "\n6. Display";</w:t>
+      </w:r>
+    </w:p>
+    <w:p>
+      <w:pPr>
+        <w:pStyle w:val="PlainText"/>
+        <w:rPr>
+          <w:rFonts w:ascii="Courier New" w:hAnsi="Courier New" w:cs="Courier New"/>
+        </w:rPr>
+      </w:pPr>
+      <w:r>
+        <w:rPr>
+          <w:rFonts w:ascii="Courier New" w:hAnsi="Courier New" w:cs="Courier New"/>
+        </w:rPr>
+        <w:t xml:space="preserve">        </w:t>
+      </w:r>
+      <w:proofErr w:type="spellStart"/>
+      <w:r>
+        <w:rPr>
+          <w:rFonts w:ascii="Courier New" w:hAnsi="Courier New" w:cs="Courier New"/>
+        </w:rPr>
+        <w:t>cout</w:t>
+      </w:r>
+      <w:proofErr w:type="spellEnd"/>
+      <w:r>
+        <w:rPr>
+          <w:rFonts w:ascii="Courier New" w:hAnsi="Courier New" w:cs="Courier New"/>
+        </w:rPr>
+        <w:t xml:space="preserve"> &lt;&lt; "\n7. Exit";</w:t>
+      </w:r>
+    </w:p>
+    <w:p>
+      <w:pPr>
+        <w:pStyle w:val="PlainText"/>
+        <w:rPr>
+          <w:rFonts w:ascii="Courier New" w:hAnsi="Courier New" w:cs="Courier New"/>
+        </w:rPr>
+      </w:pPr>
+      <w:r>
+        <w:rPr>
+          <w:rFonts w:ascii="Courier New" w:hAnsi="Courier New" w:cs="Courier New"/>
+        </w:rPr>
+        <w:t xml:space="preserve">        </w:t>
+      </w:r>
+      <w:proofErr w:type="spellStart"/>
+      <w:r>
+        <w:rPr>
+          <w:rFonts w:ascii="Courier New" w:hAnsi="Courier New" w:cs="Courier New"/>
+        </w:rPr>
+        <w:t>cout</w:t>
+      </w:r>
+      <w:proofErr w:type="spellEnd"/>
+      <w:r>
+        <w:rPr>
+          <w:rFonts w:ascii="Courier New" w:hAnsi="Courier New" w:cs="Courier New"/>
+        </w:rPr>
+        <w:t xml:space="preserve"> &lt;&lt; "\</w:t>
+      </w:r>
+      <w:proofErr w:type="spellStart"/>
+      <w:r>
+        <w:rPr>
+          <w:rFonts w:ascii="Courier New" w:hAnsi="Courier New" w:cs="Courier New"/>
+        </w:rPr>
+        <w:t>nEnter</w:t>
+      </w:r>
+      <w:proofErr w:type="spellEnd"/>
+      <w:r>
+        <w:rPr>
+          <w:rFonts w:ascii="Courier New" w:hAnsi="Courier New" w:cs="Courier New"/>
+        </w:rPr>
+        <w:t xml:space="preserve"> choice: ";</w:t>
+      </w:r>
+    </w:p>
+    <w:p>
+      <w:pPr>
+        <w:pStyle w:val="PlainText"/>
+        <w:rPr>
+          <w:rFonts w:ascii="Courier New" w:hAnsi="Courier New" w:cs="Courier New"/>
+        </w:rPr>
+      </w:pPr>
+      <w:r>
+        <w:rPr>
+          <w:rFonts w:ascii="Courier New" w:hAnsi="Courier New" w:cs="Courier New"/>
+        </w:rPr>
+        <w:t xml:space="preserve">        </w:t>
+      </w:r>
+      <w:proofErr w:type="spellStart"/>
+      <w:r>
+        <w:rPr>
+          <w:rFonts w:ascii="Courier New" w:hAnsi="Courier New" w:cs="Courier New"/>
+        </w:rPr>
+        <w:t>cin</w:t>
+      </w:r>
+      <w:proofErr w:type="spellEnd"/>
+      <w:r>
+        <w:rPr>
+          <w:rFonts w:ascii="Courier New" w:hAnsi="Courier New" w:cs="Courier New"/>
+        </w:rPr>
+        <w:t xml:space="preserve"> &gt;&gt; choice;</w:t>
+      </w:r>
+    </w:p>
+    <w:p>
+      <w:pPr>
+        <w:pStyle w:val="PlainText"/>
+        <w:rPr>
+          <w:rFonts w:ascii="Courier New" w:hAnsi="Courier New" w:cs="Courier New"/>
+        </w:rPr>
+      </w:pPr>
+    </w:p>
+    <w:p>
+      <w:pPr>
+        <w:pStyle w:val="PlainText"/>
+        <w:rPr>
+          <w:rFonts w:ascii="Courier New" w:hAnsi="Courier New" w:cs="Courier New"/>
+        </w:rPr>
+      </w:pPr>
+      <w:r>
+        <w:rPr>
+          <w:rFonts w:ascii="Courier New" w:hAnsi="Courier New" w:cs="Courier New"/>
+        </w:rPr>
+        <w:t xml:space="preserve">        switch(choice){</w:t>
+      </w:r>
+    </w:p>
+    <w:p>
+      <w:pPr>
+        <w:pStyle w:val="PlainText"/>
+        <w:rPr>
+          <w:rFonts w:ascii="Courier New" w:hAnsi="Courier New" w:cs="Courier New"/>
+        </w:rPr>
+      </w:pPr>
+    </w:p>
+    <w:p>
+      <w:pPr>
+        <w:pStyle w:val="PlainText"/>
+        <w:rPr>
+          <w:rFonts w:ascii="Courier New" w:hAnsi="Courier New" w:cs="Courier New"/>
+        </w:rPr>
+      </w:pPr>
+      <w:r>
+        <w:rPr>
+          <w:rFonts w:ascii="Courier New" w:hAnsi="Courier New" w:cs="Courier New"/>
+        </w:rPr>
+        <w:t xml:space="preserve">            case 1:</w:t>
+      </w:r>
+    </w:p>
+    <w:p>
+      <w:pPr>
+        <w:pStyle w:val="PlainText"/>
+        <w:rPr>
+          <w:rFonts w:ascii="Courier New" w:hAnsi="Courier New" w:cs="Courier New"/>
+        </w:rPr>
+      </w:pPr>
+      <w:r>
+        <w:rPr>
+          <w:rFonts w:ascii="Courier New" w:hAnsi="Courier New" w:cs="Courier New"/>
+        </w:rPr>
+        <w:t xml:space="preserve">                </w:t>
+      </w:r>
+      <w:proofErr w:type="spellStart"/>
+      <w:r>
+        <w:rPr>
+          <w:rFonts w:ascii="Courier New" w:hAnsi="Courier New" w:cs="Courier New"/>
+        </w:rPr>
+        <w:t>cout</w:t>
+      </w:r>
+      <w:proofErr w:type="spellEnd"/>
+      <w:r>
+        <w:rPr>
+          <w:rFonts w:ascii="Courier New" w:hAnsi="Courier New" w:cs="Courier New"/>
+        </w:rPr>
+        <w:t xml:space="preserve"> &lt;&lt; "Enter value: ";</w:t>
+      </w:r>
+    </w:p>
+    <w:p>
+      <w:pPr>
+        <w:pStyle w:val="PlainText"/>
+        <w:rPr>
+          <w:rFonts w:ascii="Courier New" w:hAnsi="Courier New" w:cs="Courier New"/>
+        </w:rPr>
+      </w:pPr>
+      <w:r>
+        <w:rPr>
+          <w:rFonts w:ascii="Courier New" w:hAnsi="Courier New" w:cs="Courier New"/>
+        </w:rPr>
+        <w:t xml:space="preserve">                </w:t>
+      </w:r>
+      <w:proofErr w:type="spellStart"/>
+      <w:r>
+        <w:rPr>
+          <w:rFonts w:ascii="Courier New" w:hAnsi="Courier New" w:cs="Courier New"/>
+        </w:rPr>
+        <w:t>cin</w:t>
+      </w:r>
+      <w:proofErr w:type="spellEnd"/>
+      <w:r>
+        <w:rPr>
+          <w:rFonts w:ascii="Courier New" w:hAnsi="Courier New" w:cs="Courier New"/>
+        </w:rPr>
+        <w:t xml:space="preserve"> &gt;&gt; </w:t>
+      </w:r>
+      <w:proofErr w:type="spellStart"/>
+      <w:r>
+        <w:rPr>
+          <w:rFonts w:ascii="Courier New" w:hAnsi="Courier New" w:cs="Courier New"/>
+        </w:rPr>
+        <w:t>val</w:t>
+      </w:r>
+      <w:proofErr w:type="spellEnd"/>
+      <w:r>
+        <w:rPr>
+          <w:rFonts w:ascii="Courier New" w:hAnsi="Courier New" w:cs="Courier New"/>
+        </w:rPr>
+        <w:t>;</w:t>
+      </w:r>
+    </w:p>
+    <w:p>
+      <w:pPr>
+        <w:pStyle w:val="PlainText"/>
+        <w:rPr>
+          <w:rFonts w:ascii="Courier New" w:hAnsi="Courier New" w:cs="Courier New"/>
+        </w:rPr>
+      </w:pPr>
+      <w:r>
+        <w:rPr>
+          <w:rFonts w:ascii="Courier New" w:hAnsi="Courier New" w:cs="Courier New"/>
+        </w:rPr>
+        <w:t xml:space="preserve">                </w:t>
+      </w:r>
+      <w:proofErr w:type="spellStart"/>
+      <w:r>
+        <w:rPr>
+          <w:rFonts w:ascii="Courier New" w:hAnsi="Courier New" w:cs="Courier New"/>
+        </w:rPr>
+        <w:t>c.insertEnd</w:t>
+      </w:r>
+      <w:proofErr w:type="spellEnd"/>
+      <w:r>
+        <w:rPr>
+          <w:rFonts w:ascii="Courier New" w:hAnsi="Courier New" w:cs="Courier New"/>
+        </w:rPr>
+        <w:t>(</w:t>
+      </w:r>
+      <w:proofErr w:type="spellStart"/>
+      <w:r>
+        <w:rPr>
+          <w:rFonts w:ascii="Courier New" w:hAnsi="Courier New" w:cs="Courier New"/>
+        </w:rPr>
+        <w:t>val</w:t>
+      </w:r>
+      <w:proofErr w:type="spellEnd"/>
+      <w:r>
+        <w:rPr>
+          <w:rFonts w:ascii="Courier New" w:hAnsi="Courier New" w:cs="Courier New"/>
+        </w:rPr>
+        <w:t>);</w:t>
+      </w:r>
+    </w:p>
+    <w:p>
+      <w:pPr>
+        <w:pStyle w:val="PlainText"/>
+        <w:rPr>
+          <w:rFonts w:ascii="Courier New" w:hAnsi="Courier New" w:cs="Courier New"/>
+        </w:rPr>
+      </w:pPr>
+      <w:r>
+        <w:rPr>
+          <w:rFonts w:ascii="Courier New" w:hAnsi="Courier New" w:cs="Courier New"/>
+        </w:rPr>
+        <w:t xml:space="preserve">                break;</w:t>
+      </w:r>
+    </w:p>
+    <w:p>
+      <w:pPr>
+        <w:pStyle w:val="PlainText"/>
+        <w:rPr>
+          <w:rFonts w:ascii="Courier New" w:hAnsi="Courier New" w:cs="Courier New"/>
+        </w:rPr>
+      </w:pPr>
+    </w:p>
+    <w:p>
+      <w:pPr>
+        <w:pStyle w:val="PlainText"/>
+        <w:rPr>
+          <w:rFonts w:ascii="Courier New" w:hAnsi="Courier New" w:cs="Courier New"/>
+        </w:rPr>
+      </w:pPr>
+      <w:r>
+        <w:rPr>
+          <w:rFonts w:ascii="Courier New" w:hAnsi="Courier New" w:cs="Courier New"/>
+        </w:rPr>
+        <w:t xml:space="preserve">            case 2:</w:t>
+      </w:r>
+    </w:p>
+    <w:p>
+      <w:pPr>
+        <w:pStyle w:val="PlainText"/>
+        <w:rPr>
+          <w:rFonts w:ascii="Courier New" w:hAnsi="Courier New" w:cs="Courier New"/>
+        </w:rPr>
+      </w:pPr>
+      <w:r>
+        <w:rPr>
+          <w:rFonts w:ascii="Courier New" w:hAnsi="Courier New" w:cs="Courier New"/>
+        </w:rPr>
+        <w:t xml:space="preserve">                </w:t>
+      </w:r>
+      <w:proofErr w:type="spellStart"/>
+      <w:r>
+        <w:rPr>
+          <w:rFonts w:ascii="Courier New" w:hAnsi="Courier New" w:cs="Courier New"/>
+        </w:rPr>
+        <w:t>cout</w:t>
+      </w:r>
+      <w:proofErr w:type="spellEnd"/>
+      <w:r>
+        <w:rPr>
+          <w:rFonts w:ascii="Courier New" w:hAnsi="Courier New" w:cs="Courier New"/>
+        </w:rPr>
+        <w:t xml:space="preserve"> &lt;&lt; "Enter value: ";</w:t>
+      </w:r>
+    </w:p>
+    <w:p>
+      <w:pPr>
+        <w:pStyle w:val="PlainText"/>
+        <w:rPr>
+          <w:rFonts w:ascii="Courier New" w:hAnsi="Courier New" w:cs="Courier New"/>
+        </w:rPr>
+      </w:pPr>
+      <w:r>
+        <w:rPr>
+          <w:rFonts w:ascii="Courier New" w:hAnsi="Courier New" w:cs="Courier New"/>
+        </w:rPr>
+        <w:t xml:space="preserve">                </w:t>
+      </w:r>
+      <w:proofErr w:type="spellStart"/>
+      <w:r>
+        <w:rPr>
+          <w:rFonts w:ascii="Courier New" w:hAnsi="Courier New" w:cs="Courier New"/>
+        </w:rPr>
+        <w:t>cin</w:t>
+      </w:r>
+      <w:proofErr w:type="spellEnd"/>
+      <w:r>
+        <w:rPr>
+          <w:rFonts w:ascii="Courier New" w:hAnsi="Courier New" w:cs="Courier New"/>
+        </w:rPr>
+        <w:t xml:space="preserve"> &gt;&gt; </w:t>
+      </w:r>
+      <w:proofErr w:type="spellStart"/>
+      <w:r>
+        <w:rPr>
+          <w:rFonts w:ascii="Courier New" w:hAnsi="Courier New" w:cs="Courier New"/>
+        </w:rPr>
+        <w:t>val</w:t>
+      </w:r>
+      <w:proofErr w:type="spellEnd"/>
+      <w:r>
+        <w:rPr>
+          <w:rFonts w:ascii="Courier New" w:hAnsi="Courier New" w:cs="Courier New"/>
+        </w:rPr>
+        <w:t>;</w:t>
+      </w:r>
+    </w:p>
+    <w:p>
+      <w:pPr>
+        <w:pStyle w:val="PlainText"/>
+        <w:rPr>
+          <w:rFonts w:ascii="Courier New" w:hAnsi="Courier New" w:cs="Courier New"/>
+        </w:rPr>
+      </w:pPr>
+      <w:r>
+        <w:rPr>
+          <w:rFonts w:ascii="Courier New" w:hAnsi="Courier New" w:cs="Courier New"/>
+        </w:rPr>
+        <w:t xml:space="preserve">                </w:t>
+      </w:r>
+      <w:proofErr w:type="spellStart"/>
+      <w:r>
+        <w:rPr>
+          <w:rFonts w:ascii="Courier New" w:hAnsi="Courier New" w:cs="Courier New"/>
+        </w:rPr>
+        <w:t>c.insertBeg</w:t>
+      </w:r>
+      <w:proofErr w:type="spellEnd"/>
+      <w:r>
+        <w:rPr>
+          <w:rFonts w:ascii="Courier New" w:hAnsi="Courier New" w:cs="Courier New"/>
+        </w:rPr>
+        <w:t>(</w:t>
+      </w:r>
+      <w:proofErr w:type="spellStart"/>
+      <w:r>
+        <w:rPr>
+          <w:rFonts w:ascii="Courier New" w:hAnsi="Courier New" w:cs="Courier New"/>
+        </w:rPr>
+        <w:t>val</w:t>
+      </w:r>
+      <w:proofErr w:type="spellEnd"/>
+      <w:r>
+        <w:rPr>
+          <w:rFonts w:ascii="Courier New" w:hAnsi="Courier New" w:cs="Courier New"/>
+        </w:rPr>
+        <w:t>);</w:t>
+      </w:r>
+    </w:p>
+    <w:p>
+      <w:pPr>
+        <w:pStyle w:val="PlainText"/>
+        <w:rPr>
+          <w:rFonts w:ascii="Courier New" w:hAnsi="Courier New" w:cs="Courier New"/>
+        </w:rPr>
+      </w:pPr>
+      <w:r>
+        <w:rPr>
+          <w:rFonts w:ascii="Courier New" w:hAnsi="Courier New" w:cs="Courier New"/>
+        </w:rPr>
+        <w:t xml:space="preserve">                break;</w:t>
+      </w:r>
+    </w:p>
+    <w:p>
+      <w:pPr>
+        <w:pStyle w:val="PlainText"/>
+        <w:rPr>
+          <w:rFonts w:ascii="Courier New" w:hAnsi="Courier New" w:cs="Courier New"/>
+        </w:rPr>
+      </w:pPr>
+    </w:p>
+    <w:p>
+      <w:pPr>
+        <w:pStyle w:val="PlainText"/>
+        <w:rPr>
+          <w:rFonts w:ascii="Courier New" w:hAnsi="Courier New" w:cs="Courier New"/>
+        </w:rPr>
+      </w:pPr>
+      <w:r>
+        <w:rPr>
+          <w:rFonts w:ascii="Courier New" w:hAnsi="Courier New" w:cs="Courier New"/>
+        </w:rPr>
+        <w:t xml:space="preserve">            case 3:</w:t>
+      </w:r>
+    </w:p>
+    <w:p>
+      <w:pPr>
+        <w:pStyle w:val="PlainText"/>
+        <w:rPr>
+          <w:rFonts w:ascii="Courier New" w:hAnsi="Courier New" w:cs="Courier New"/>
+        </w:rPr>
+      </w:pPr>
+      <w:r>
+        <w:rPr>
+          <w:rFonts w:ascii="Courier New" w:hAnsi="Courier New" w:cs="Courier New"/>
+        </w:rPr>
+        <w:t xml:space="preserve">                </w:t>
+      </w:r>
+      <w:proofErr w:type="spellStart"/>
+      <w:r>
+        <w:rPr>
+          <w:rFonts w:ascii="Courier New" w:hAnsi="Courier New" w:cs="Courier New"/>
+        </w:rPr>
+        <w:t>cout</w:t>
+      </w:r>
+      <w:proofErr w:type="spellEnd"/>
+      <w:r>
+        <w:rPr>
+          <w:rFonts w:ascii="Courier New" w:hAnsi="Courier New" w:cs="Courier New"/>
+        </w:rPr>
+        <w:t xml:space="preserve"> &lt;&lt; "Enter value: ";</w:t>
+      </w:r>
+    </w:p>
+    <w:p>
+      <w:pPr>
+        <w:pStyle w:val="PlainText"/>
+        <w:rPr>
+          <w:rFonts w:ascii="Courier New" w:hAnsi="Courier New" w:cs="Courier New"/>
+        </w:rPr>
+      </w:pPr>
+      <w:r>
+        <w:rPr>
+          <w:rFonts w:ascii="Courier New" w:hAnsi="Courier New" w:cs="Courier New"/>
+        </w:rPr>
+        <w:t xml:space="preserve">                </w:t>
+      </w:r>
+      <w:proofErr w:type="spellStart"/>
+      <w:r>
+        <w:rPr>
+          <w:rFonts w:ascii="Courier New" w:hAnsi="Courier New" w:cs="Courier New"/>
+        </w:rPr>
+        <w:t>cin</w:t>
+      </w:r>
+      <w:proofErr w:type="spellEnd"/>
+      <w:r>
+        <w:rPr>
+          <w:rFonts w:ascii="Courier New" w:hAnsi="Courier New" w:cs="Courier New"/>
+        </w:rPr>
+        <w:t xml:space="preserve"> &gt;&gt; </w:t>
+      </w:r>
+      <w:proofErr w:type="spellStart"/>
+      <w:r>
+        <w:rPr>
+          <w:rFonts w:ascii="Courier New" w:hAnsi="Courier New" w:cs="Courier New"/>
+        </w:rPr>
+        <w:t>val</w:t>
+      </w:r>
+      <w:proofErr w:type="spellEnd"/>
+      <w:r>
+        <w:rPr>
+          <w:rFonts w:ascii="Courier New" w:hAnsi="Courier New" w:cs="Courier New"/>
+        </w:rPr>
+        <w:t>;</w:t>
+      </w:r>
+    </w:p>
+    <w:p>
+      <w:pPr>
+        <w:pStyle w:val="PlainText"/>
+        <w:rPr>
+          <w:rFonts w:ascii="Courier New" w:hAnsi="Courier New" w:cs="Courier New"/>
+        </w:rPr>
+      </w:pPr>
+      <w:r>
+        <w:rPr>
+          <w:rFonts w:ascii="Courier New" w:hAnsi="Courier New" w:cs="Courier New"/>
+        </w:rPr>
+        <w:t xml:space="preserve">                </w:t>
+      </w:r>
+      <w:proofErr w:type="spellStart"/>
+      <w:r>
+        <w:rPr>
+          <w:rFonts w:ascii="Courier New" w:hAnsi="Courier New" w:cs="Courier New"/>
+        </w:rPr>
+        <w:t>cout</w:t>
+      </w:r>
+      <w:proofErr w:type="spellEnd"/>
+      <w:r>
+        <w:rPr>
+          <w:rFonts w:ascii="Courier New" w:hAnsi="Courier New" w:cs="Courier New"/>
+        </w:rPr>
+        <w:t xml:space="preserve"> &lt;&lt; "Enter position: ";</w:t>
+      </w:r>
+    </w:p>
+    <w:p>
+      <w:pPr>
+        <w:pStyle w:val="PlainText"/>
+        <w:rPr>
+          <w:rFonts w:ascii="Courier New" w:hAnsi="Courier New" w:cs="Courier New"/>
+        </w:rPr>
+      </w:pPr>
+      <w:r>
+        <w:rPr>
+          <w:rFonts w:ascii="Courier New" w:hAnsi="Courier New" w:cs="Courier New"/>
+        </w:rPr>
+        <w:t xml:space="preserve">                </w:t>
+      </w:r>
+      <w:proofErr w:type="spellStart"/>
+      <w:r>
+        <w:rPr>
+          <w:rFonts w:ascii="Courier New" w:hAnsi="Courier New" w:cs="Courier New"/>
+        </w:rPr>
+        <w:t>cin</w:t>
+      </w:r>
+      <w:proofErr w:type="spellEnd"/>
+      <w:r>
+        <w:rPr>
+          <w:rFonts w:ascii="Courier New" w:hAnsi="Courier New" w:cs="Courier New"/>
+        </w:rPr>
+        <w:t xml:space="preserve"> &gt;&gt; pos;</w:t>
+      </w:r>
+    </w:p>
+    <w:p>
+      <w:pPr>
+        <w:pStyle w:val="PlainText"/>
+        <w:rPr>
+          <w:rFonts w:ascii="Courier New" w:hAnsi="Courier New" w:cs="Courier New"/>
+        </w:rPr>
+      </w:pPr>
+      <w:r>
+        <w:rPr>
+          <w:rFonts w:ascii="Courier New" w:hAnsi="Courier New" w:cs="Courier New"/>
+        </w:rPr>
+        <w:t xml:space="preserve">                </w:t>
+      </w:r>
+      <w:proofErr w:type="spellStart"/>
+      <w:r>
+        <w:rPr>
+          <w:rFonts w:ascii="Courier New" w:hAnsi="Courier New" w:cs="Courier New"/>
+        </w:rPr>
+        <w:t>c.insertPos</w:t>
+      </w:r>
+      <w:proofErr w:type="spellEnd"/>
+      <w:r>
+        <w:rPr>
+          <w:rFonts w:ascii="Courier New" w:hAnsi="Courier New" w:cs="Courier New"/>
+        </w:rPr>
+        <w:t>(</w:t>
+      </w:r>
+      <w:proofErr w:type="spellStart"/>
+      <w:r>
+        <w:rPr>
+          <w:rFonts w:ascii="Courier New" w:hAnsi="Courier New" w:cs="Courier New"/>
+        </w:rPr>
+        <w:t>val</w:t>
+      </w:r>
+      <w:proofErr w:type="spellEnd"/>
+      <w:r>
+        <w:rPr>
+          <w:rFonts w:ascii="Courier New" w:hAnsi="Courier New" w:cs="Courier New"/>
+        </w:rPr>
+        <w:t>, pos);</w:t>
+      </w:r>
+    </w:p>
+    <w:p>
+      <w:pPr>
+        <w:pStyle w:val="PlainText"/>
+        <w:rPr>
+          <w:rFonts w:ascii="Courier New" w:hAnsi="Courier New" w:cs="Courier New"/>
+        </w:rPr>
+      </w:pPr>
+      <w:r>
+        <w:rPr>
+          <w:rFonts w:ascii="Courier New" w:hAnsi="Courier New" w:cs="Courier New"/>
+        </w:rPr>
+        <w:t xml:space="preserve">                break;</w:t>
+      </w:r>
+    </w:p>
+    <w:p>
+      <w:pPr>
+        <w:pStyle w:val="PlainText"/>
+        <w:rPr>
+          <w:rFonts w:ascii="Courier New" w:hAnsi="Courier New" w:cs="Courier New"/>
+        </w:rPr>
+      </w:pPr>
+    </w:p>
+    <w:p>
+      <w:pPr>
+        <w:pStyle w:val="PlainText"/>
+        <w:rPr>
+          <w:rFonts w:ascii="Courier New" w:hAnsi="Courier New" w:cs="Courier New"/>
+        </w:rPr>
+      </w:pPr>
+      <w:r>
+        <w:rPr>
+          <w:rFonts w:ascii="Courier New" w:hAnsi="Courier New" w:cs="Courier New"/>
+        </w:rPr>
+        <w:lastRenderedPageBreak/>
+        <w:t xml:space="preserve">            case 4:</w:t>
+      </w:r>
+    </w:p>
+    <w:p>
+      <w:pPr>
+        <w:pStyle w:val="PlainText"/>
+        <w:rPr>
+          <w:rFonts w:ascii="Courier New" w:hAnsi="Courier New" w:cs="Courier New"/>
+        </w:rPr>
+      </w:pPr>
+      <w:r>
+        <w:rPr>
+          <w:rFonts w:ascii="Courier New" w:hAnsi="Courier New" w:cs="Courier New"/>
+        </w:rPr>
+        <w:t xml:space="preserve">                </w:t>
+      </w:r>
+      <w:proofErr w:type="spellStart"/>
+      <w:r>
+        <w:rPr>
+          <w:rFonts w:ascii="Courier New" w:hAnsi="Courier New" w:cs="Courier New"/>
+        </w:rPr>
+        <w:t>cout</w:t>
+      </w:r>
+      <w:proofErr w:type="spellEnd"/>
+      <w:r>
+        <w:rPr>
+          <w:rFonts w:ascii="Courier New" w:hAnsi="Courier New" w:cs="Courier New"/>
+        </w:rPr>
+        <w:t xml:space="preserve"> &lt;&lt; "Enter position: ";</w:t>
+      </w:r>
+    </w:p>
+    <w:p>
+      <w:pPr>
+        <w:pStyle w:val="PlainText"/>
+        <w:rPr>
+          <w:rFonts w:ascii="Courier New" w:hAnsi="Courier New" w:cs="Courier New"/>
+        </w:rPr>
+      </w:pPr>
+      <w:r>
+        <w:rPr>
+          <w:rFonts w:ascii="Courier New" w:hAnsi="Courier New" w:cs="Courier New"/>
+        </w:rPr>
+        <w:t xml:space="preserve">                </w:t>
+      </w:r>
+      <w:proofErr w:type="spellStart"/>
+      <w:r>
+        <w:rPr>
+          <w:rFonts w:ascii="Courier New" w:hAnsi="Courier New" w:cs="Courier New"/>
+        </w:rPr>
+        <w:t>cin</w:t>
+      </w:r>
+      <w:proofErr w:type="spellEnd"/>
+      <w:r>
+        <w:rPr>
+          <w:rFonts w:ascii="Courier New" w:hAnsi="Courier New" w:cs="Courier New"/>
+        </w:rPr>
+        <w:t xml:space="preserve"> &gt;&gt; pos;</w:t>
+      </w:r>
+    </w:p>
+    <w:p>
+      <w:pPr>
+        <w:pStyle w:val="PlainText"/>
+        <w:rPr>
+          <w:rFonts w:ascii="Courier New" w:hAnsi="Courier New" w:cs="Courier New"/>
+        </w:rPr>
+      </w:pPr>
+      <w:r>
+        <w:rPr>
+          <w:rFonts w:ascii="Courier New" w:hAnsi="Courier New" w:cs="Courier New"/>
+        </w:rPr>
+        <w:t xml:space="preserve">                </w:t>
+      </w:r>
+      <w:proofErr w:type="spellStart"/>
+      <w:r>
+        <w:rPr>
+          <w:rFonts w:ascii="Courier New" w:hAnsi="Courier New" w:cs="Courier New"/>
+        </w:rPr>
+        <w:t>c.deleteNode</w:t>
+      </w:r>
+      <w:proofErr w:type="spellEnd"/>
+      <w:r>
+        <w:rPr>
+          <w:rFonts w:ascii="Courier New" w:hAnsi="Courier New" w:cs="Courier New"/>
+        </w:rPr>
+        <w:t>(pos);</w:t>
+      </w:r>
+    </w:p>
+    <w:p>
+      <w:pPr>
+        <w:pStyle w:val="PlainText"/>
+        <w:rPr>
+          <w:rFonts w:ascii="Courier New" w:hAnsi="Courier New" w:cs="Courier New"/>
+        </w:rPr>
+      </w:pPr>
+      <w:r>
+        <w:rPr>
+          <w:rFonts w:ascii="Courier New" w:hAnsi="Courier New" w:cs="Courier New"/>
+        </w:rPr>
+        <w:t xml:space="preserve">                break;</w:t>
+      </w:r>
+    </w:p>
+    <w:p>
+      <w:pPr>
+        <w:pStyle w:val="PlainText"/>
+        <w:rPr>
+          <w:rFonts w:ascii="Courier New" w:hAnsi="Courier New" w:cs="Courier New"/>
+        </w:rPr>
+      </w:pPr>
+    </w:p>
+    <w:p>
+      <w:pPr>
+        <w:pStyle w:val="PlainText"/>
+        <w:rPr>
+          <w:rFonts w:ascii="Courier New" w:hAnsi="Courier New" w:cs="Courier New"/>
+        </w:rPr>
+      </w:pPr>
+      <w:r>
+        <w:rPr>
+          <w:rFonts w:ascii="Courier New" w:hAnsi="Courier New" w:cs="Courier New"/>
+        </w:rPr>
+        <w:t xml:space="preserve">            case 5:</w:t>
+      </w:r>
+    </w:p>
+    <w:p>
+      <w:pPr>
+        <w:pStyle w:val="PlainText"/>
+        <w:rPr>
+          <w:rFonts w:ascii="Courier New" w:hAnsi="Courier New" w:cs="Courier New"/>
+        </w:rPr>
+      </w:pPr>
+      <w:r>
+        <w:rPr>
+          <w:rFonts w:ascii="Courier New" w:hAnsi="Courier New" w:cs="Courier New"/>
+        </w:rPr>
+        <w:t xml:space="preserve">                </w:t>
+      </w:r>
+      <w:proofErr w:type="spellStart"/>
+      <w:r>
+        <w:rPr>
+          <w:rFonts w:ascii="Courier New" w:hAnsi="Courier New" w:cs="Courier New"/>
+        </w:rPr>
+        <w:t>cout</w:t>
+      </w:r>
+      <w:proofErr w:type="spellEnd"/>
+      <w:r>
+        <w:rPr>
+          <w:rFonts w:ascii="Courier New" w:hAnsi="Courier New" w:cs="Courier New"/>
+        </w:rPr>
+        <w:t xml:space="preserve"> &lt;&lt; "Enter value: ";</w:t>
+      </w:r>
+    </w:p>
+    <w:p>
+      <w:pPr>
+        <w:pStyle w:val="PlainText"/>
+        <w:rPr>
+          <w:rFonts w:ascii="Courier New" w:hAnsi="Courier New" w:cs="Courier New"/>
+        </w:rPr>
+      </w:pPr>
+      <w:r>
+        <w:rPr>
+          <w:rFonts w:ascii="Courier New" w:hAnsi="Courier New" w:cs="Courier New"/>
+        </w:rPr>
+        <w:t xml:space="preserve">                </w:t>
+      </w:r>
+      <w:proofErr w:type="spellStart"/>
+      <w:r>
+        <w:rPr>
+          <w:rFonts w:ascii="Courier New" w:hAnsi="Courier New" w:cs="Courier New"/>
+        </w:rPr>
+        <w:t>cin</w:t>
+      </w:r>
+      <w:proofErr w:type="spellEnd"/>
+      <w:r>
+        <w:rPr>
+          <w:rFonts w:ascii="Courier New" w:hAnsi="Courier New" w:cs="Courier New"/>
+        </w:rPr>
+        <w:t xml:space="preserve"> &gt;&gt; </w:t>
+      </w:r>
+      <w:proofErr w:type="spellStart"/>
+      <w:r>
+        <w:rPr>
+          <w:rFonts w:ascii="Courier New" w:hAnsi="Courier New" w:cs="Courier New"/>
+        </w:rPr>
+        <w:t>val</w:t>
+      </w:r>
+      <w:proofErr w:type="spellEnd"/>
+      <w:r>
+        <w:rPr>
+          <w:rFonts w:ascii="Courier New" w:hAnsi="Courier New" w:cs="Courier New"/>
+        </w:rPr>
+        <w:t>;</w:t>
+      </w:r>
+    </w:p>
+    <w:p>
+      <w:pPr>
+        <w:pStyle w:val="PlainText"/>
+        <w:rPr>
+          <w:rFonts w:ascii="Courier New" w:hAnsi="Courier New" w:cs="Courier New"/>
+        </w:rPr>
+      </w:pPr>
+      <w:r>
+        <w:rPr>
+          <w:rFonts w:ascii="Courier New" w:hAnsi="Courier New" w:cs="Courier New"/>
+        </w:rPr>
+        <w:t xml:space="preserve">                </w:t>
+      </w:r>
+      <w:proofErr w:type="spellStart"/>
+      <w:r>
+        <w:rPr>
+          <w:rFonts w:ascii="Courier New" w:hAnsi="Courier New" w:cs="Courier New"/>
+        </w:rPr>
+        <w:t>c.search</w:t>
+      </w:r>
+      <w:proofErr w:type="spellEnd"/>
+      <w:r>
+        <w:rPr>
+          <w:rFonts w:ascii="Courier New" w:hAnsi="Courier New" w:cs="Courier New"/>
+        </w:rPr>
+        <w:t>(</w:t>
+      </w:r>
+      <w:proofErr w:type="spellStart"/>
+      <w:r>
+        <w:rPr>
+          <w:rFonts w:ascii="Courier New" w:hAnsi="Courier New" w:cs="Courier New"/>
+        </w:rPr>
+        <w:t>val</w:t>
+      </w:r>
+      <w:proofErr w:type="spellEnd"/>
+      <w:r>
+        <w:rPr>
+          <w:rFonts w:ascii="Courier New" w:hAnsi="Courier New" w:cs="Courier New"/>
+        </w:rPr>
+        <w:t>);</w:t>
+      </w:r>
+    </w:p>
+    <w:p>
+      <w:pPr>
+        <w:pStyle w:val="PlainText"/>
+        <w:rPr>
+          <w:rFonts w:ascii="Courier New" w:hAnsi="Courier New" w:cs="Courier New"/>
+        </w:rPr>
+      </w:pPr>
+      <w:r>
+        <w:rPr>
+          <w:rFonts w:ascii="Courier New" w:hAnsi="Courier New" w:cs="Courier New"/>
+        </w:rPr>
+        <w:t xml:space="preserve">                break;</w:t>
+      </w:r>
+    </w:p>
+    <w:p>
+      <w:pPr>
+        <w:pStyle w:val="PlainText"/>
+        <w:rPr>
+          <w:rFonts w:ascii="Courier New" w:hAnsi="Courier New" w:cs="Courier New"/>
+        </w:rPr>
+      </w:pPr>
+    </w:p>
+    <w:p>
+      <w:pPr>
+        <w:pStyle w:val="PlainText"/>
+        <w:rPr>
+          <w:rFonts w:ascii="Courier New" w:hAnsi="Courier New" w:cs="Courier New"/>
+        </w:rPr>
+      </w:pPr>
+      <w:r>
+        <w:rPr>
+          <w:rFonts w:ascii="Courier New" w:hAnsi="Courier New" w:cs="Courier New"/>
+        </w:rPr>
+        <w:t xml:space="preserve">            case 6:</w:t>
+      </w:r>
+    </w:p>
+    <w:p>
+      <w:pPr>
+        <w:pStyle w:val="PlainText"/>
+        <w:rPr>
+          <w:rFonts w:ascii="Courier New" w:hAnsi="Courier New" w:cs="Courier New"/>
+        </w:rPr>
+      </w:pPr>
+      <w:r>
+        <w:rPr>
+          <w:rFonts w:ascii="Courier New" w:hAnsi="Courier New" w:cs="Courier New"/>
+        </w:rPr>
+        <w:t xml:space="preserve">                </w:t>
+      </w:r>
+      <w:proofErr w:type="spellStart"/>
+      <w:r>
+        <w:rPr>
+          <w:rFonts w:ascii="Courier New" w:hAnsi="Courier New" w:cs="Courier New"/>
+        </w:rPr>
+        <w:t>c.display</w:t>
+      </w:r>
+      <w:proofErr w:type="spellEnd"/>
+      <w:r>
+        <w:rPr>
+          <w:rFonts w:ascii="Courier New" w:hAnsi="Courier New" w:cs="Courier New"/>
+        </w:rPr>
+        <w:t>();</w:t>
+      </w:r>
+    </w:p>
+    <w:p>
+      <w:pPr>
+        <w:pStyle w:val="PlainText"/>
+        <w:rPr>
+          <w:rFonts w:ascii="Courier New" w:hAnsi="Courier New" w:cs="Courier New"/>
+        </w:rPr>
+      </w:pPr>
+      <w:r>
+        <w:rPr>
+          <w:rFonts w:ascii="Courier New" w:hAnsi="Courier New" w:cs="Courier New"/>
+        </w:rPr>
+        <w:t xml:space="preserve">                break;</w:t>
+      </w:r>
+    </w:p>
+    <w:p>
+      <w:pPr>
+        <w:pStyle w:val="PlainText"/>
+        <w:rPr>
+          <w:rFonts w:ascii="Courier New" w:hAnsi="Courier New" w:cs="Courier New"/>
+        </w:rPr>
+      </w:pPr>
+    </w:p>
+    <w:p>
+      <w:pPr>
+        <w:pStyle w:val="PlainText"/>
+        <w:rPr>
+          <w:rFonts w:ascii="Courier New" w:hAnsi="Courier New" w:cs="Courier New"/>
+        </w:rPr>
+      </w:pPr>
+      <w:r>
+        <w:rPr>
+          <w:rFonts w:ascii="Courier New" w:hAnsi="Courier New" w:cs="Courier New"/>
+        </w:rPr>
+        <w:t xml:space="preserve">            case 7:</w:t>
+      </w:r>
+    </w:p>
+    <w:p>
+      <w:pPr>
+        <w:pStyle w:val="PlainText"/>
+        <w:rPr>
+          <w:rFonts w:ascii="Courier New" w:hAnsi="Courier New" w:cs="Courier New"/>
+        </w:rPr>
+      </w:pPr>
+      <w:r>
+        <w:rPr>
+          <w:rFonts w:ascii="Courier New" w:hAnsi="Courier New" w:cs="Courier New"/>
+        </w:rPr>
+        <w:t xml:space="preserve">                </w:t>
+      </w:r>
+      <w:proofErr w:type="spellStart"/>
+      <w:r>
+        <w:rPr>
+          <w:rFonts w:ascii="Courier New" w:hAnsi="Courier New" w:cs="Courier New"/>
+        </w:rPr>
+        <w:t>cout</w:t>
+      </w:r>
+      <w:proofErr w:type="spellEnd"/>
+      <w:r>
+        <w:rPr>
+          <w:rFonts w:ascii="Courier New" w:hAnsi="Courier New" w:cs="Courier New"/>
+        </w:rPr>
+        <w:t xml:space="preserve"> &lt;&lt; "Program ended";</w:t>
+      </w:r>
+    </w:p>
+    <w:p>
+      <w:pPr>
+        <w:pStyle w:val="PlainText"/>
+        <w:rPr>
+          <w:rFonts w:ascii="Courier New" w:hAnsi="Courier New" w:cs="Courier New"/>
+        </w:rPr>
+      </w:pPr>
+      <w:r>
+        <w:rPr>
+          <w:rFonts w:ascii="Courier New" w:hAnsi="Courier New" w:cs="Courier New"/>
+        </w:rPr>
+        <w:t xml:space="preserve">                break;</w:t>
+      </w:r>
+    </w:p>
+    <w:p>
+      <w:pPr>
+        <w:pStyle w:val="PlainText"/>
+        <w:rPr>
+          <w:rFonts w:ascii="Courier New" w:hAnsi="Courier New" w:cs="Courier New"/>
+        </w:rPr>
+      </w:pPr>
+    </w:p>
+    <w:p>
+      <w:pPr>
+        <w:pStyle w:val="PlainText"/>
+        <w:rPr>
+          <w:rFonts w:ascii="Courier New" w:hAnsi="Courier New" w:cs="Courier New"/>
+        </w:rPr>
+      </w:pPr>
+      <w:r>
+        <w:rPr>
+          <w:rFonts w:ascii="Courier New" w:hAnsi="Courier New" w:cs="Courier New"/>
+        </w:rPr>
+        <w:t xml:space="preserve">            default:</w:t>
+      </w:r>
+    </w:p>
+    <w:p>
+      <w:pPr>
+        <w:pStyle w:val="PlainText"/>
+        <w:rPr>
+          <w:rFonts w:ascii="Courier New" w:hAnsi="Courier New" w:cs="Courier New"/>
+        </w:rPr>
+      </w:pPr>
+      <w:r>
+        <w:rPr>
+          <w:rFonts w:ascii="Courier New" w:hAnsi="Courier New" w:cs="Courier New"/>
+        </w:rPr>
+        <w:t xml:space="preserve">                </w:t>
+      </w:r>
+      <w:proofErr w:type="spellStart"/>
+      <w:r>
+        <w:rPr>
+          <w:rFonts w:ascii="Courier New" w:hAnsi="Courier New" w:cs="Courier New"/>
+        </w:rPr>
+        <w:t>cout</w:t>
+      </w:r>
+      <w:proofErr w:type="spellEnd"/>
+      <w:r>
+        <w:rPr>
+          <w:rFonts w:ascii="Courier New" w:hAnsi="Courier New" w:cs="Courier New"/>
+        </w:rPr>
+        <w:t xml:space="preserve"> &lt;&lt; "Invalid choice";</w:t>
+      </w:r>
+    </w:p>
+    <w:p>
+      <w:pPr>
+        <w:pStyle w:val="PlainText"/>
+        <w:rPr>
+          <w:rFonts w:ascii="Courier New" w:hAnsi="Courier New" w:cs="Courier New"/>
+        </w:rPr>
+      </w:pPr>
+      <w:r>
+        <w:rPr>
+          <w:rFonts w:ascii="Courier New" w:hAnsi="Courier New" w:cs="Courier New"/>
+        </w:rPr>
+        <w:t xml:space="preserve">        }</w:t>
+      </w:r>
+    </w:p>
+    <w:p>
+      <w:pPr>
+        <w:pStyle w:val="PlainText"/>
+        <w:rPr>
+          <w:rFonts w:ascii="Courier New" w:hAnsi="Courier New" w:cs="Courier New"/>
+        </w:rPr>
+      </w:pPr>
+    </w:p>
+    <w:p>
+      <w:pPr>
+        <w:pStyle w:val="PlainText"/>
+        <w:rPr>
+          <w:rFonts w:ascii="Courier New" w:hAnsi="Courier New" w:cs="Courier New"/>
+        </w:rPr>
+      </w:pPr>
+      <w:r>
+        <w:rPr>
+          <w:rFonts w:ascii="Courier New" w:hAnsi="Courier New" w:cs="Courier New"/>
+        </w:rPr>
+        <w:t xml:space="preserve">    }while(choice != 7);</w:t>
+      </w:r>
+    </w:p>
+    <w:p>
+      <w:pPr>
+        <w:pStyle w:val="PlainText"/>
+        <w:rPr>
+          <w:rFonts w:ascii="Courier New" w:hAnsi="Courier New" w:cs="Courier New"/>
+        </w:rPr>
+      </w:pPr>
+      <w:r>
+        <w:rPr>
+          <w:rFonts w:ascii="Courier New" w:hAnsi="Courier New" w:cs="Courier New"/>
+        </w:rPr>
+        <w:t>}</w:t>
+      </w:r>
+    </w:p>
+    <w:p/>
+    <w:p>
+      <w:r>
+        <w:lastRenderedPageBreak/>
+        <w:t>OUTPUT:</w:t>
+      </w:r>
+      <w:r>
+        <w:br/>
+      </w:r>
+      <w:r>
+        <w:drawing>
+          <wp:inline distT="0" distB="0" distL="0" distR="0" wp14:anchorId="0141C369" wp14:editId="52F23875">
+            <wp:extent cx="1663786" cy="4134062"/>
+            <wp:effectExtent l="0" t="0" r="0" b="0"/>
+            <wp:docPr id="2053407777" name="Picture 1"/>
+            <wp:cNvGraphicFramePr>
+              <a:graphicFrameLocks xmlns:a="http://schemas.openxmlformats.org/drawingml/2006/main" noChangeAspect="1"/>
+            </wp:cNvGraphicFramePr>
+            <a:graphic xmlns:a="http://schemas.openxmlformats.org/drawingml/2006/main">
+              <a:graphicData uri="http://schemas.openxmlformats.org/drawingml/2006/picture">
+                <pic:pic xmlns:pic="http://schemas.openxmlformats.org/drawingml/2006/picture">
+                  <pic:nvPicPr>
+                    <pic:cNvPr id="2053407777" name=""/>
+                    <pic:cNvPicPr/>
+                  </pic:nvPicPr>
+                  <pic:blipFill>
+                    <a:blip r:embed="rId12"/>
+                    <a:stretch>
+                      <a:fillRect/>
+                    </a:stretch>
+                  </pic:blipFill>
+                  <pic:spPr>
+                    <a:xfrm>
+                      <a:off x="0" y="0"/>
+                      <a:ext cx="1663786" cy="4134062"/>
+                    </a:xfrm>
+                    <a:prstGeom prst="rect">
+                      <a:avLst/>
+                    </a:prstGeom>
+                  </pic:spPr>
+                </pic:pic>
+              </a:graphicData>
+            </a:graphic>
+          </wp:inline>
+        </w:drawing>
+      </w:r>
+      <w:r>
+        <w:drawing>
+          <wp:inline distT="0" distB="0" distL="0" distR="0" wp14:anchorId="68699634" wp14:editId="35B446FF">
+            <wp:extent cx="1606633" cy="4267419"/>
+            <wp:effectExtent l="0" t="0" r="0" b="0"/>
+            <wp:docPr id="1727641707" name="Picture 1"/>
+            <wp:cNvGraphicFramePr>
+              <a:graphicFrameLocks xmlns:a="http://schemas.openxmlformats.org/drawingml/2006/main" noChangeAspect="1"/>
+            </wp:cNvGraphicFramePr>
+            <a:graphic xmlns:a="http://schemas.openxmlformats.org/drawingml/2006/main">
+              <a:graphicData uri="http://schemas.openxmlformats.org/drawingml/2006/picture">
+                <pic:pic xmlns:pic="http://schemas.openxmlformats.org/drawingml/2006/picture">
+                  <pic:nvPicPr>
+                    <pic:cNvPr id="1727641707" name=""/>
+                    <pic:cNvPicPr/>
+                  </pic:nvPicPr>
+                  <pic:blipFill>
+                    <a:blip r:embed="rId13"/>
+                    <a:stretch>
+                      <a:fillRect/>
+                    </a:stretch>
+                  </pic:blipFill>
+                  <pic:spPr>
+                    <a:xfrm>
+                      <a:off x="0" y="0"/>
+                      <a:ext cx="1606633" cy="4267419"/>
+                    </a:xfrm>
+                    <a:prstGeom prst="rect">
+                      <a:avLst/>
+                    </a:prstGeom>
+                  </pic:spPr>
+                </pic:pic>
+              </a:graphicData>
+            </a:graphic>
+          </wp:inline>
+        </w:drawing>
+      </w:r>
+      <w:r>
+        <w:drawing>
+          <wp:inline distT="0" distB="0" distL="0" distR="0" wp14:anchorId="7947DA2D" wp14:editId="5489E815">
+            <wp:extent cx="1682836" cy="1187511"/>
+            <wp:effectExtent l="0" t="0" r="0" b="0"/>
+            <wp:docPr id="567980183" name="Picture 1"/>
+            <wp:cNvGraphicFramePr>
+              <a:graphicFrameLocks xmlns:a="http://schemas.openxmlformats.org/drawingml/2006/main" noChangeAspect="1"/>
+            </wp:cNvGraphicFramePr>
+            <a:graphic xmlns:a="http://schemas.openxmlformats.org/drawingml/2006/main">
+              <a:graphicData uri="http://schemas.openxmlformats.org/drawingml/2006/picture">
+                <pic:pic xmlns:pic="http://schemas.openxmlformats.org/drawingml/2006/picture">
+                  <pic:nvPicPr>
+                    <pic:cNvPr id="567980183" name=""/>
+                    <pic:cNvPicPr/>
+                  </pic:nvPicPr>
+                  <pic:blipFill>
+                    <a:blip r:embed="rId14"/>
+                    <a:stretch>
+                      <a:fillRect/>
+                    </a:stretch>
+                  </pic:blipFill>
+                  <pic:spPr>
+                    <a:xfrm>
+                      <a:off x="0" y="0"/>
+                      <a:ext cx="1682836" cy="1187511"/>
+                    </a:xfrm>
+                    <a:prstGeom prst="rect">
+                      <a:avLst/>
+                    </a:prstGeom>
+                  </pic:spPr>
+                </pic:pic>
+              </a:graphicData>
+            </a:graphic>
+          </wp:inline>
+        </w:drawing>
+      </w:r>
+    </w:p>
+    <w:p/>
+    <w:p>
+      <w:r>
+        <w:t>Q10:</w:t>
+      </w:r>
+      <w:r>
+        <w:br/>
         <w:t>CODE:</w:t>
       </w:r>
       <w:r>

</xml_diff>